<commit_message>
Added MPGW Import In the Instructions
</commit_message>
<xml_diff>
--- a/NFCU-DATAPOWER-OPENSHIFT-DEPLOYMENT-LAB-v3.2.0.docx
+++ b/NFCU-DATAPOWER-OPENSHIFT-DEPLOYMENT-LAB-v3.2.0.docx
@@ -1,6 +1,6 @@
 
 <file path=word/document.xml><?xml version="1.0" encoding="utf-8"?>
-<w:document xmlns:wpc="http://schemas.microsoft.com/office/word/2010/wordprocessingCanvas" xmlns:cx="http://schemas.microsoft.com/office/drawing/2014/chartex" xmlns:cx1="http://schemas.microsoft.com/office/drawing/2015/9/8/chartex" xmlns:cx2="http://schemas.microsoft.com/office/drawing/2015/10/21/chartex" xmlns:cx3="http://schemas.microsoft.com/office/drawing/2016/5/9/chartex" xmlns:cx4="http://schemas.microsoft.com/office/drawing/2016/5/10/chartex" xmlns:cx5="http://schemas.microsoft.com/office/drawing/2016/5/11/chartex" xmlns:cx6="http://schemas.microsoft.com/office/drawing/2016/5/12/chartex" xmlns:cx7="http://schemas.microsoft.com/office/drawing/2016/5/13/chartex" xmlns:cx8="http://schemas.microsoft.com/office/drawing/2016/5/14/chartex" xmlns:mc="http://schemas.openxmlformats.org/markup-compatibility/2006" xmlns:m="http://schemas.openxmlformats.org/officeDocument/2006/math" xmlns:aink="http://schemas.microsoft.com/office/drawing/2016/ink" xmlns:am3d="http://schemas.microsoft.com/office/drawing/2017/model3d" xmlns:oel="http://schemas.microsoft.com/office/2019/extlst" xmlns:r="http://schemas.openxmlformats.org/officeDocument/2006/relationships" xmlns:wp14="http://schemas.microsoft.com/office/word/2010/wordprocessingDrawing" xmlns:wp="http://schemas.openxmlformats.org/drawingml/2006/wordprocessingDrawing" xmlns:wpg="http://schemas.microsoft.com/office/word/2010/wordprocessingGroup" xmlns:wpi="http://schemas.microsoft.com/office/word/2010/wordprocessingInk" xmlns:wps="http://schemas.microsoft.com/office/word/2010/wordprocessingShape" xmlns:o="urn:schemas-microsoft-com:office:office" xmlns:v="urn:schemas-microsoft-com:vml" xmlns:w10="urn:schemas-microsoft-com:office:word" xmlns:w="http://schemas.openxmlformats.org/wordprocessingml/2006/main" xmlns:w14="http://schemas.microsoft.com/office/word/2010/wordml" xmlns:w15="http://schemas.microsoft.com/office/word/2012/wordml" xmlns:w16cex="http://schemas.microsoft.com/office/word/2018/wordml/cex" xmlns:w16cid="http://schemas.microsoft.com/office/word/2016/wordml/cid" xmlns:w16="http://schemas.microsoft.com/office/word/2018/wordml" xmlns:w16sdtdh="http://schemas.microsoft.com/office/word/2020/wordml/sdtdatahash" xmlns:w16sdtfl="http://schemas.microsoft.com/office/word/2024/wordml/sdtformatlock" xmlns:w16se="http://schemas.microsoft.com/office/word/2015/wordml/symex" xmlns:w16du="http://schemas.microsoft.com/office/word/2023/wordml/word16du" xmlns:wne="http://schemas.microsoft.com/office/word/2006/wordml" mc:Ignorable="w14 w15 w16se w16cid w16 w16cex w16sdtdh w16sdtfl w16du wp14">
+<w:document xmlns:wpc="http://schemas.microsoft.com/office/word/2010/wordprocessingCanvas" xmlns:cx="http://schemas.microsoft.com/office/drawing/2014/chartex" xmlns:cx1="http://schemas.microsoft.com/office/drawing/2015/9/8/chartex" xmlns:cx2="http://schemas.microsoft.com/office/drawing/2015/10/21/chartex" xmlns:cx3="http://schemas.microsoft.com/office/drawing/2016/5/9/chartex" xmlns:cx4="http://schemas.microsoft.com/office/drawing/2016/5/10/chartex" xmlns:cx5="http://schemas.microsoft.com/office/drawing/2016/5/11/chartex" xmlns:cx6="http://schemas.microsoft.com/office/drawing/2016/5/12/chartex" xmlns:cx7="http://schemas.microsoft.com/office/drawing/2016/5/13/chartex" xmlns:cx8="http://schemas.microsoft.com/office/drawing/2016/5/14/chartex" xmlns:mc="http://schemas.openxmlformats.org/markup-compatibility/2006" xmlns:aink="http://schemas.microsoft.com/office/drawing/2016/ink" xmlns:am3d="http://schemas.microsoft.com/office/drawing/2017/model3d" xmlns:o="urn:schemas-microsoft-com:office:office" xmlns:oel="http://schemas.microsoft.com/office/2019/extlst" xmlns:r="http://schemas.openxmlformats.org/officeDocument/2006/relationships" xmlns:m="http://schemas.openxmlformats.org/officeDocument/2006/math" xmlns:v="urn:schemas-microsoft-com:vml" xmlns:wp14="http://schemas.microsoft.com/office/word/2010/wordprocessingDrawing" xmlns:wp="http://schemas.openxmlformats.org/drawingml/2006/wordprocessingDrawing" xmlns:w10="urn:schemas-microsoft-com:office:word" xmlns:w="http://schemas.openxmlformats.org/wordprocessingml/2006/main" xmlns:w14="http://schemas.microsoft.com/office/word/2010/wordml" xmlns:w15="http://schemas.microsoft.com/office/word/2012/wordml" xmlns:w16cex="http://schemas.microsoft.com/office/word/2018/wordml/cex" xmlns:w16cid="http://schemas.microsoft.com/office/word/2016/wordml/cid" xmlns:w16="http://schemas.microsoft.com/office/word/2018/wordml" xmlns:w16du="http://schemas.microsoft.com/office/word/2023/wordml/word16du" xmlns:w16sdtdh="http://schemas.microsoft.com/office/word/2020/wordml/sdtdatahash" xmlns:w16sdtfl="http://schemas.microsoft.com/office/word/2024/wordml/sdtformatlock" xmlns:w16se="http://schemas.microsoft.com/office/word/2015/wordml/symex" xmlns:wpg="http://schemas.microsoft.com/office/word/2010/wordprocessingGroup" xmlns:wpi="http://schemas.microsoft.com/office/word/2010/wordprocessingInk" xmlns:wne="http://schemas.microsoft.com/office/word/2006/wordml" xmlns:wps="http://schemas.microsoft.com/office/word/2010/wordprocessingShape" mc:Ignorable="w14 w15 w16se w16cid w16 w16cex w16sdtdh w16sdtfl w16du wp14">
   <w:body>
     <w:p>
       <w:pPr>
@@ -17,7 +17,10 @@
         <w:spacing w:after="120"/>
       </w:pPr>
       <w:r>
-        <w:t>Version: 3.2.0</w:t>
+        <w:t>Version: 3.2.</w:t>
+      </w:r>
+      <w:r>
+        <w:t>1</w:t>
       </w:r>
       <w:r>
         <w:br/>
@@ -333,7 +336,7 @@
           <w:bottom w:w="80" w:type="dxa"/>
           <w:right w:w="120" w:type="dxa"/>
         </w:tblCellMar>
-        <w:tblLook w:val="0000" w:firstRow="0" w:lastRow="0" w:firstColumn="0" w:lastColumn="0" w:noHBand="0" w:noVBand="0"/>
+        <w:tblLook w:val="04A0" w:firstRow="1" w:lastRow="0" w:firstColumn="1" w:lastColumn="0" w:noHBand="0" w:noVBand="1"/>
       </w:tblPr>
       <w:tblGrid>
         <w:gridCol w:w="3492"/>
@@ -490,7 +493,7 @@
           <w:bottom w:w="80" w:type="dxa"/>
           <w:right w:w="120" w:type="dxa"/>
         </w:tblCellMar>
-        <w:tblLook w:val="0000" w:firstRow="0" w:lastRow="0" w:firstColumn="0" w:lastColumn="0" w:noHBand="0" w:noVBand="0"/>
+        <w:tblLook w:val="04A0" w:firstRow="1" w:lastRow="0" w:firstColumn="1" w:lastColumn="0" w:noHBand="0" w:noVBand="1"/>
       </w:tblPr>
       <w:tblGrid>
         <w:gridCol w:w="4294"/>
@@ -678,7 +681,7 @@
           <w:bottom w:w="80" w:type="dxa"/>
           <w:right w:w="120" w:type="dxa"/>
         </w:tblCellMar>
-        <w:tblLook w:val="0000" w:firstRow="0" w:lastRow="0" w:firstColumn="0" w:lastColumn="0" w:noHBand="0" w:noVBand="0"/>
+        <w:tblLook w:val="04A0" w:firstRow="1" w:lastRow="0" w:firstColumn="1" w:lastColumn="0" w:noHBand="0" w:noVBand="1"/>
       </w:tblPr>
       <w:tblGrid>
         <w:gridCol w:w="3732"/>
@@ -816,7 +819,7 @@
           <w:bottom w:w="80" w:type="dxa"/>
           <w:right w:w="120" w:type="dxa"/>
         </w:tblCellMar>
-        <w:tblLook w:val="0000" w:firstRow="0" w:lastRow="0" w:firstColumn="0" w:lastColumn="0" w:noHBand="0" w:noVBand="0"/>
+        <w:tblLook w:val="04A0" w:firstRow="1" w:lastRow="0" w:firstColumn="1" w:lastColumn="0" w:noHBand="0" w:noVBand="1"/>
       </w:tblPr>
       <w:tblGrid>
         <w:gridCol w:w="5664"/>
@@ -963,14 +966,6 @@
     </w:p>
     <w:p>
       <w:pPr>
-        <w:spacing w:after="200"/>
-      </w:pPr>
-      <w:r>
-        <w:t xml:space="preserve"> </w:t>
-      </w:r>
-    </w:p>
-    <w:p>
-      <w:pPr>
         <w:spacing w:after="120"/>
       </w:pPr>
       <w:r>
@@ -1074,15 +1069,15 @@
         <w:spacing w:after="120"/>
       </w:pPr>
       <w:r>
+        <w:t>Example username/password login:</w:t>
+      </w:r>
+    </w:p>
+    <w:p>
+      <w:pPr>
+        <w:spacing w:after="200"/>
+      </w:pPr>
+      <w:r>
         <w:lastRenderedPageBreak/>
-        <w:t>Example username/password login:</w:t>
-      </w:r>
-    </w:p>
-    <w:p>
-      <w:pPr>
-        <w:spacing w:after="200"/>
-      </w:pPr>
-      <w:r>
         <w:t xml:space="preserve"> </w:t>
       </w:r>
     </w:p>
@@ -1164,14 +1159,6 @@
           <w:szCs w:val="20"/>
         </w:rPr>
         <w:t xml:space="preserve">         </w:t>
-      </w:r>
-    </w:p>
-    <w:p>
-      <w:pPr>
-        <w:spacing w:after="200"/>
-      </w:pPr>
-      <w:r>
-        <w:t xml:space="preserve"> </w:t>
       </w:r>
     </w:p>
     <w:p>
@@ -1289,7 +1276,6 @@
         </w:numPr>
         <w:spacing w:after="100"/>
       </w:pPr>
-      <w:proofErr w:type="spellStart"/>
       <w:r>
         <w:rPr>
           <w:rFonts w:ascii="Courier New" w:eastAsia="Courier New" w:hAnsi="Courier New" w:cs="Courier New"/>
@@ -1297,6 +1283,7 @@
         </w:rPr>
         <w:t>webgui-</w:t>
       </w:r>
+      <w:proofErr w:type="spellStart"/>
       <w:proofErr w:type="gramStart"/>
       <w:r>
         <w:rPr>
@@ -1317,7 +1304,6 @@
         </w:numPr>
         <w:spacing w:after="100"/>
       </w:pPr>
-      <w:proofErr w:type="spellStart"/>
       <w:r>
         <w:rPr>
           <w:rFonts w:ascii="Courier New" w:eastAsia="Courier New" w:hAnsi="Courier New" w:cs="Courier New"/>
@@ -1325,6 +1311,7 @@
         </w:rPr>
         <w:t>webgui-</w:t>
       </w:r>
+      <w:proofErr w:type="spellStart"/>
       <w:proofErr w:type="gramStart"/>
       <w:r>
         <w:rPr>
@@ -1493,34 +1480,39 @@
       <w:pPr>
         <w:spacing w:after="120"/>
       </w:pPr>
-      <w:r>
-        <w:t>Authenticate to the cluster and confirm your CLI access works.</w:t>
-      </w:r>
-    </w:p>
-    <w:p>
-      <w:pPr>
-        <w:spacing w:after="200"/>
+      <w:proofErr w:type="gramStart"/>
+      <w:r>
+        <w:t>Authenticate to</w:t>
+      </w:r>
+      <w:proofErr w:type="gramEnd"/>
+      <w:r>
+        <w:t xml:space="preserve"> the cluster and confirm your CLI access works.</w:t>
+      </w:r>
+    </w:p>
+    <w:p>
+      <w:pPr>
+        <w:spacing w:after="200"/>
+      </w:pPr>
+      <w:r>
+        <w:t xml:space="preserve"> </w:t>
+      </w:r>
+    </w:p>
+    <w:p>
+      <w:pPr>
+        <w:pStyle w:val="Heading3"/>
+        <w:spacing w:after="200"/>
+      </w:pPr>
+      <w:r>
+        <w:t>Steps</w:t>
+      </w:r>
+    </w:p>
+    <w:p>
+      <w:pPr>
+        <w:spacing w:after="100"/>
+        <w:ind w:left="20"/>
       </w:pPr>
       <w:r>
         <w:lastRenderedPageBreak/>
-        <w:t xml:space="preserve"> </w:t>
-      </w:r>
-    </w:p>
-    <w:p>
-      <w:pPr>
-        <w:pStyle w:val="Heading3"/>
-        <w:spacing w:after="200"/>
-      </w:pPr>
-      <w:r>
-        <w:t>Steps</w:t>
-      </w:r>
-    </w:p>
-    <w:p>
-      <w:pPr>
-        <w:spacing w:after="100"/>
-        <w:ind w:left="20"/>
-      </w:pPr>
-      <w:r>
         <w:t xml:space="preserve">1. Get your login command from the OpenShift console using </w:t>
       </w:r>
       <w:r>
@@ -1557,18 +1549,6 @@
         <w:spacing w:before="160" w:after="200"/>
         <w:ind w:left="240" w:right="240"/>
       </w:pPr>
-      <w:r>
-        <w:rPr>
-          <w:rFonts w:ascii="Courier New" w:eastAsia="Courier New" w:hAnsi="Courier New" w:cs="Courier New"/>
-          <w:color w:val="FFFFFF"/>
-          <w:sz w:val="20"/>
-          <w:szCs w:val="20"/>
-        </w:rPr>
-        <w:t xml:space="preserve">         </w:t>
-      </w:r>
-      <w:r>
-        <w:br/>
-      </w:r>
       <w:r>
         <w:rPr>
           <w:rFonts w:ascii="Courier New" w:eastAsia="Courier New" w:hAnsi="Courier New" w:cs="Courier New"/>
@@ -2030,111 +2010,111 @@
           <w:sz w:val="20"/>
           <w:szCs w:val="20"/>
         </w:rPr>
+        <w:t xml:space="preserve">         </w:t>
+      </w:r>
+      <w:r>
+        <w:br/>
+      </w:r>
+      <w:r>
+        <w:rPr>
+          <w:rFonts w:ascii="Courier New" w:eastAsia="Courier New" w:hAnsi="Courier New" w:cs="Courier New"/>
+          <w:color w:val="FFFFFF"/>
+          <w:sz w:val="20"/>
+          <w:szCs w:val="20"/>
+        </w:rPr>
+        <w:t xml:space="preserve">    </w:t>
+      </w:r>
+      <w:proofErr w:type="spellStart"/>
+      <w:r>
+        <w:rPr>
+          <w:rFonts w:ascii="Courier New" w:eastAsia="Courier New" w:hAnsi="Courier New" w:cs="Courier New"/>
+          <w:color w:val="FFFFFF"/>
+          <w:sz w:val="20"/>
+          <w:szCs w:val="20"/>
+        </w:rPr>
+        <w:t>oc</w:t>
+      </w:r>
+      <w:proofErr w:type="spellEnd"/>
+      <w:r>
+        <w:rPr>
+          <w:rFonts w:ascii="Courier New" w:eastAsia="Courier New" w:hAnsi="Courier New" w:cs="Courier New"/>
+          <w:color w:val="FFFFFF"/>
+          <w:sz w:val="20"/>
+          <w:szCs w:val="20"/>
+        </w:rPr>
+        <w:t xml:space="preserve"> project </w:t>
+      </w:r>
+      <w:proofErr w:type="spellStart"/>
+      <w:r>
+        <w:rPr>
+          <w:rFonts w:ascii="Courier New" w:eastAsia="Courier New" w:hAnsi="Courier New" w:cs="Courier New"/>
+          <w:color w:val="FFFFFF"/>
+          <w:sz w:val="20"/>
+          <w:szCs w:val="20"/>
+        </w:rPr>
+        <w:t>nfcu</w:t>
+      </w:r>
+      <w:proofErr w:type="spellEnd"/>
+      <w:r>
+        <w:rPr>
+          <w:rFonts w:ascii="Courier New" w:eastAsia="Courier New" w:hAnsi="Courier New" w:cs="Courier New"/>
+          <w:color w:val="FFFFFF"/>
+          <w:sz w:val="20"/>
+          <w:szCs w:val="20"/>
+        </w:rPr>
+        <w:t xml:space="preserve">-demo    </w:t>
+      </w:r>
+      <w:r>
+        <w:br/>
+      </w:r>
+      <w:r>
+        <w:rPr>
+          <w:rFonts w:ascii="Courier New" w:eastAsia="Courier New" w:hAnsi="Courier New" w:cs="Courier New"/>
+          <w:color w:val="FFFFFF"/>
+          <w:sz w:val="20"/>
+          <w:szCs w:val="20"/>
+        </w:rPr>
+        <w:t xml:space="preserve">    </w:t>
+      </w:r>
+      <w:proofErr w:type="spellStart"/>
+      <w:r>
+        <w:rPr>
+          <w:rFonts w:ascii="Courier New" w:eastAsia="Courier New" w:hAnsi="Courier New" w:cs="Courier New"/>
+          <w:color w:val="FFFFFF"/>
+          <w:sz w:val="20"/>
+          <w:szCs w:val="20"/>
+        </w:rPr>
+        <w:t>oc</w:t>
+      </w:r>
+      <w:proofErr w:type="spellEnd"/>
+      <w:r>
+        <w:rPr>
+          <w:rFonts w:ascii="Courier New" w:eastAsia="Courier New" w:hAnsi="Courier New" w:cs="Courier New"/>
+          <w:color w:val="FFFFFF"/>
+          <w:sz w:val="20"/>
+          <w:szCs w:val="20"/>
+        </w:rPr>
+        <w:t xml:space="preserve"> project    </w:t>
+      </w:r>
+      <w:r>
+        <w:br/>
+      </w:r>
+      <w:r>
+        <w:rPr>
+          <w:rFonts w:ascii="Courier New" w:eastAsia="Courier New" w:hAnsi="Courier New" w:cs="Courier New"/>
+          <w:color w:val="FFFFFF"/>
+          <w:sz w:val="20"/>
+          <w:szCs w:val="20"/>
+        </w:rPr>
+        <w:t xml:space="preserve">         </w:t>
+      </w:r>
+    </w:p>
+    <w:p>
+      <w:pPr>
+        <w:spacing w:after="200"/>
+      </w:pPr>
+      <w:r>
         <w:lastRenderedPageBreak/>
-        <w:t xml:space="preserve">         </w:t>
-      </w:r>
-      <w:r>
-        <w:br/>
-      </w:r>
-      <w:r>
-        <w:rPr>
-          <w:rFonts w:ascii="Courier New" w:eastAsia="Courier New" w:hAnsi="Courier New" w:cs="Courier New"/>
-          <w:color w:val="FFFFFF"/>
-          <w:sz w:val="20"/>
-          <w:szCs w:val="20"/>
-        </w:rPr>
-        <w:t xml:space="preserve">    </w:t>
-      </w:r>
-      <w:proofErr w:type="spellStart"/>
-      <w:r>
-        <w:rPr>
-          <w:rFonts w:ascii="Courier New" w:eastAsia="Courier New" w:hAnsi="Courier New" w:cs="Courier New"/>
-          <w:color w:val="FFFFFF"/>
-          <w:sz w:val="20"/>
-          <w:szCs w:val="20"/>
-        </w:rPr>
-        <w:t>oc</w:t>
-      </w:r>
-      <w:proofErr w:type="spellEnd"/>
-      <w:r>
-        <w:rPr>
-          <w:rFonts w:ascii="Courier New" w:eastAsia="Courier New" w:hAnsi="Courier New" w:cs="Courier New"/>
-          <w:color w:val="FFFFFF"/>
-          <w:sz w:val="20"/>
-          <w:szCs w:val="20"/>
-        </w:rPr>
-        <w:t xml:space="preserve"> project </w:t>
-      </w:r>
-      <w:proofErr w:type="spellStart"/>
-      <w:r>
-        <w:rPr>
-          <w:rFonts w:ascii="Courier New" w:eastAsia="Courier New" w:hAnsi="Courier New" w:cs="Courier New"/>
-          <w:color w:val="FFFFFF"/>
-          <w:sz w:val="20"/>
-          <w:szCs w:val="20"/>
-        </w:rPr>
-        <w:t>nfcu</w:t>
-      </w:r>
-      <w:proofErr w:type="spellEnd"/>
-      <w:r>
-        <w:rPr>
-          <w:rFonts w:ascii="Courier New" w:eastAsia="Courier New" w:hAnsi="Courier New" w:cs="Courier New"/>
-          <w:color w:val="FFFFFF"/>
-          <w:sz w:val="20"/>
-          <w:szCs w:val="20"/>
-        </w:rPr>
-        <w:t xml:space="preserve">-demo    </w:t>
-      </w:r>
-      <w:r>
-        <w:br/>
-      </w:r>
-      <w:r>
-        <w:rPr>
-          <w:rFonts w:ascii="Courier New" w:eastAsia="Courier New" w:hAnsi="Courier New" w:cs="Courier New"/>
-          <w:color w:val="FFFFFF"/>
-          <w:sz w:val="20"/>
-          <w:szCs w:val="20"/>
-        </w:rPr>
-        <w:t xml:space="preserve">    </w:t>
-      </w:r>
-      <w:proofErr w:type="spellStart"/>
-      <w:r>
-        <w:rPr>
-          <w:rFonts w:ascii="Courier New" w:eastAsia="Courier New" w:hAnsi="Courier New" w:cs="Courier New"/>
-          <w:color w:val="FFFFFF"/>
-          <w:sz w:val="20"/>
-          <w:szCs w:val="20"/>
-        </w:rPr>
-        <w:t>oc</w:t>
-      </w:r>
-      <w:proofErr w:type="spellEnd"/>
-      <w:r>
-        <w:rPr>
-          <w:rFonts w:ascii="Courier New" w:eastAsia="Courier New" w:hAnsi="Courier New" w:cs="Courier New"/>
-          <w:color w:val="FFFFFF"/>
-          <w:sz w:val="20"/>
-          <w:szCs w:val="20"/>
-        </w:rPr>
-        <w:t xml:space="preserve"> project    </w:t>
-      </w:r>
-      <w:r>
-        <w:br/>
-      </w:r>
-      <w:r>
-        <w:rPr>
-          <w:rFonts w:ascii="Courier New" w:eastAsia="Courier New" w:hAnsi="Courier New" w:cs="Courier New"/>
-          <w:color w:val="FFFFFF"/>
-          <w:sz w:val="20"/>
-          <w:szCs w:val="20"/>
-        </w:rPr>
-        <w:t xml:space="preserve">         </w:t>
-      </w:r>
-    </w:p>
-    <w:p>
-      <w:pPr>
-        <w:spacing w:after="200"/>
-      </w:pPr>
-      <w:r>
         <w:t xml:space="preserve"> </w:t>
       </w:r>
     </w:p>
@@ -2253,27 +2233,31 @@
       </w:r>
       <w:proofErr w:type="spellStart"/>
       <w:r>
-        <w:t>the</w:t>
-      </w:r>
-      <w:proofErr w:type="spellEnd"/>
-      <w:r>
-        <w:t xml:space="preserve"> </w:t>
-      </w:r>
-      <w:proofErr w:type="spellStart"/>
-      <w:r>
+        <w:rPr>
+          <w:rFonts w:ascii="Courier New" w:eastAsia="Courier New" w:hAnsi="Courier New" w:cs="Courier New"/>
+          <w:shd w:val="clear" w:color="auto" w:fill="F1F5F9"/>
+        </w:rPr>
         <w:t>datapower</w:t>
       </w:r>
       <w:proofErr w:type="spellEnd"/>
       <w:r>
+        <w:rPr>
+          <w:rFonts w:ascii="Courier New" w:eastAsia="Courier New" w:hAnsi="Courier New" w:cs="Courier New"/>
+          <w:shd w:val="clear" w:color="auto" w:fill="F1F5F9"/>
+        </w:rPr>
         <w:t>-catalog-source-</w:t>
       </w:r>
       <w:proofErr w:type="spellStart"/>
       <w:r>
+        <w:rPr>
+          <w:rFonts w:ascii="Courier New" w:eastAsia="Courier New" w:hAnsi="Courier New" w:cs="Courier New"/>
+          <w:shd w:val="clear" w:color="auto" w:fill="F1F5F9"/>
+        </w:rPr>
         <w:t>latest.yaml</w:t>
       </w:r>
       <w:proofErr w:type="spellEnd"/>
       <w:r>
-        <w:t xml:space="preserve"> file and copy the contents</w:t>
+        <w:t xml:space="preserve"> file and copy the contents.</w:t>
       </w:r>
     </w:p>
     <w:p>
@@ -2316,15 +2300,27 @@
       </w:r>
       <w:proofErr w:type="spellStart"/>
       <w:r>
+        <w:rPr>
+          <w:rFonts w:ascii="Courier New" w:eastAsia="Courier New" w:hAnsi="Courier New" w:cs="Courier New"/>
+          <w:shd w:val="clear" w:color="auto" w:fill="F1F5F9"/>
+        </w:rPr>
         <w:t>datapower</w:t>
       </w:r>
       <w:proofErr w:type="spellEnd"/>
       <w:r>
+        <w:rPr>
+          <w:rFonts w:ascii="Courier New" w:eastAsia="Courier New" w:hAnsi="Courier New" w:cs="Courier New"/>
+          <w:shd w:val="clear" w:color="auto" w:fill="F1F5F9"/>
+        </w:rPr>
         <w:t>-catalog-source-</w:t>
       </w:r>
       <w:proofErr w:type="spellStart"/>
       <w:proofErr w:type="gramStart"/>
       <w:r>
+        <w:rPr>
+          <w:rFonts w:ascii="Courier New" w:eastAsia="Courier New" w:hAnsi="Courier New" w:cs="Courier New"/>
+          <w:shd w:val="clear" w:color="auto" w:fill="F1F5F9"/>
+        </w:rPr>
         <w:t>latest.yaml</w:t>
       </w:r>
       <w:proofErr w:type="spellEnd"/>
@@ -2731,7 +2727,6 @@
         <w:spacing w:after="100"/>
       </w:pPr>
       <w:r>
-        <w:lastRenderedPageBreak/>
         <w:t xml:space="preserve">If </w:t>
       </w:r>
       <w:r>
@@ -2755,6 +2750,7 @@
         <w:spacing w:after="100"/>
       </w:pPr>
       <w:r>
+        <w:lastRenderedPageBreak/>
         <w:t xml:space="preserve">If </w:t>
       </w:r>
       <w:r>
@@ -3052,7 +3048,15 @@
         <w:spacing w:after="100"/>
       </w:pPr>
       <w:r>
-        <w:t>Operator pod is running</w:t>
+        <w:t xml:space="preserve">Operator </w:t>
+      </w:r>
+      <w:proofErr w:type="gramStart"/>
+      <w:r>
+        <w:t>pod</w:t>
+      </w:r>
+      <w:proofErr w:type="gramEnd"/>
+      <w:r>
+        <w:t xml:space="preserve"> is running</w:t>
       </w:r>
     </w:p>
     <w:p>
@@ -3333,56 +3337,47 @@
           <w:sz w:val="20"/>
           <w:szCs w:val="20"/>
         </w:rPr>
-        <w:t>-admin-password --from-</w:t>
-      </w:r>
-      <w:r>
-        <w:rPr>
-          <w:rFonts w:ascii="Courier New" w:eastAsia="Courier New" w:hAnsi="Courier New" w:cs="Courier New"/>
-          <w:color w:val="FFFFFF"/>
-          <w:sz w:val="20"/>
-          <w:szCs w:val="20"/>
-        </w:rPr>
+        <w:t xml:space="preserve">-admin-password --from-literal=password=admin -n </w:t>
+      </w:r>
+      <w:proofErr w:type="spellStart"/>
+      <w:r>
+        <w:rPr>
+          <w:rFonts w:ascii="Courier New" w:eastAsia="Courier New" w:hAnsi="Courier New" w:cs="Courier New"/>
+          <w:color w:val="FFFFFF"/>
+          <w:sz w:val="20"/>
+          <w:szCs w:val="20"/>
+        </w:rPr>
+        <w:t>nfcu</w:t>
+      </w:r>
+      <w:proofErr w:type="spellEnd"/>
+      <w:r>
+        <w:rPr>
+          <w:rFonts w:ascii="Courier New" w:eastAsia="Courier New" w:hAnsi="Courier New" w:cs="Courier New"/>
+          <w:color w:val="FFFFFF"/>
+          <w:sz w:val="20"/>
+          <w:szCs w:val="20"/>
+        </w:rPr>
+        <w:t xml:space="preserve">-demo    </w:t>
+      </w:r>
+      <w:r>
+        <w:br/>
+      </w:r>
+      <w:r>
+        <w:rPr>
+          <w:rFonts w:ascii="Courier New" w:eastAsia="Courier New" w:hAnsi="Courier New" w:cs="Courier New"/>
+          <w:color w:val="FFFFFF"/>
+          <w:sz w:val="20"/>
+          <w:szCs w:val="20"/>
+        </w:rPr>
+        <w:t xml:space="preserve">         </w:t>
+      </w:r>
+    </w:p>
+    <w:p>
+      <w:pPr>
+        <w:spacing w:after="200"/>
+      </w:pPr>
+      <w:r>
         <w:lastRenderedPageBreak/>
-        <w:t xml:space="preserve">literal=password=admin -n </w:t>
-      </w:r>
-      <w:proofErr w:type="spellStart"/>
-      <w:r>
-        <w:rPr>
-          <w:rFonts w:ascii="Courier New" w:eastAsia="Courier New" w:hAnsi="Courier New" w:cs="Courier New"/>
-          <w:color w:val="FFFFFF"/>
-          <w:sz w:val="20"/>
-          <w:szCs w:val="20"/>
-        </w:rPr>
-        <w:t>nfcu</w:t>
-      </w:r>
-      <w:proofErr w:type="spellEnd"/>
-      <w:r>
-        <w:rPr>
-          <w:rFonts w:ascii="Courier New" w:eastAsia="Courier New" w:hAnsi="Courier New" w:cs="Courier New"/>
-          <w:color w:val="FFFFFF"/>
-          <w:sz w:val="20"/>
-          <w:szCs w:val="20"/>
-        </w:rPr>
-        <w:t xml:space="preserve">-demo    </w:t>
-      </w:r>
-      <w:r>
-        <w:br/>
-      </w:r>
-      <w:r>
-        <w:rPr>
-          <w:rFonts w:ascii="Courier New" w:eastAsia="Courier New" w:hAnsi="Courier New" w:cs="Courier New"/>
-          <w:color w:val="FFFFFF"/>
-          <w:sz w:val="20"/>
-          <w:szCs w:val="20"/>
-        </w:rPr>
-        <w:t xml:space="preserve">         </w:t>
-      </w:r>
-    </w:p>
-    <w:p>
-      <w:pPr>
-        <w:spacing w:after="200"/>
-      </w:pPr>
-      <w:r>
         <w:t xml:space="preserve"> </w:t>
       </w:r>
     </w:p>
@@ -3523,7 +3518,7 @@
         <w:ind w:left="20"/>
       </w:pPr>
       <w:r>
-        <w:t xml:space="preserve">4. Create the IBM entitlement secret:**Note:** This step is it allows the DataPower Operator to pull the DataPower image from the IBM Container </w:t>
+        <w:t xml:space="preserve">4. Create the IBM entitlement secret:**Note:** This step allows the DataPower Operator to pull the DataPower image from the IBM Container </w:t>
       </w:r>
       <w:proofErr w:type="spellStart"/>
       <w:r>
@@ -3872,7 +3867,27 @@
           <w:sz w:val="20"/>
           <w:szCs w:val="20"/>
         </w:rPr>
-        <w:t xml:space="preserve"> -n nfcu-demo    </w:t>
+        <w:t xml:space="preserve"> -n </w:t>
+      </w:r>
+      <w:proofErr w:type="spellStart"/>
+      <w:r>
+        <w:rPr>
+          <w:rFonts w:ascii="Courier New" w:eastAsia="Courier New" w:hAnsi="Courier New" w:cs="Courier New"/>
+          <w:color w:val="FFFFFF"/>
+          <w:sz w:val="20"/>
+          <w:szCs w:val="20"/>
+        </w:rPr>
+        <w:t>nfcu</w:t>
+      </w:r>
+      <w:proofErr w:type="spellEnd"/>
+      <w:r>
+        <w:rPr>
+          <w:rFonts w:ascii="Courier New" w:eastAsia="Courier New" w:hAnsi="Courier New" w:cs="Courier New"/>
+          <w:color w:val="FFFFFF"/>
+          <w:sz w:val="20"/>
+          <w:szCs w:val="20"/>
+        </w:rPr>
+        <w:t xml:space="preserve">-demo    </w:t>
       </w:r>
       <w:r>
         <w:br/>
@@ -4262,7 +4277,6 @@
         <w:spacing w:after="200"/>
       </w:pPr>
       <w:r>
-        <w:lastRenderedPageBreak/>
         <w:t>Checkpoint</w:t>
       </w:r>
     </w:p>
@@ -4280,6 +4294,7 @@
           <w:rFonts w:ascii="Courier New" w:eastAsia="Courier New" w:hAnsi="Courier New" w:cs="Courier New"/>
           <w:shd w:val="clear" w:color="auto" w:fill="F1F5F9"/>
         </w:rPr>
+        <w:lastRenderedPageBreak/>
         <w:t>web-</w:t>
       </w:r>
       <w:proofErr w:type="spellStart"/>
@@ -4585,8 +4600,13 @@
         </w:numPr>
         <w:spacing w:after="100"/>
       </w:pPr>
-      <w:r>
-        <w:t xml:space="preserve">the </w:t>
+      <w:proofErr w:type="gramStart"/>
+      <w:r>
+        <w:t>the</w:t>
+      </w:r>
+      <w:proofErr w:type="gramEnd"/>
+      <w:r>
+        <w:t xml:space="preserve"> </w:t>
       </w:r>
       <w:r>
         <w:rPr>
@@ -4648,8 +4668,13 @@
         </w:numPr>
         <w:spacing w:after="100"/>
       </w:pPr>
-      <w:r>
-        <w:t xml:space="preserve">the configured domains are </w:t>
+      <w:proofErr w:type="gramStart"/>
+      <w:r>
+        <w:t>the</w:t>
+      </w:r>
+      <w:proofErr w:type="gramEnd"/>
+      <w:r>
+        <w:t xml:space="preserve"> configured domains are </w:t>
       </w:r>
       <w:r>
         <w:rPr>
@@ -4922,7 +4947,6 @@
         <w:spacing w:after="100"/>
       </w:pPr>
       <w:r>
-        <w:lastRenderedPageBreak/>
         <w:t>users</w:t>
       </w:r>
     </w:p>
@@ -4949,6 +4973,7 @@
         <w:spacing w:after="100"/>
       </w:pPr>
       <w:r>
+        <w:lastRenderedPageBreak/>
         <w:t>replicas</w:t>
       </w:r>
     </w:p>
@@ -5247,1184 +5272,6 @@
           <w:szCs w:val="20"/>
         </w:rPr>
         <w:t xml:space="preserve">         </w:t>
-      </w:r>
-    </w:p>
-    <w:p>
-      <w:pPr>
-        <w:spacing w:after="200"/>
-      </w:pPr>
-      <w:r>
-        <w:t xml:space="preserve"> </w:t>
-      </w:r>
-    </w:p>
-    <w:p>
-      <w:pPr>
-        <w:pStyle w:val="Heading3"/>
-        <w:spacing w:after="200"/>
-      </w:pPr>
-      <w:r>
-        <w:t xml:space="preserve">Troubleshooting: </w:t>
-      </w:r>
-      <w:proofErr w:type="spellStart"/>
-      <w:r>
-        <w:t>DataPowerService</w:t>
-      </w:r>
-      <w:proofErr w:type="spellEnd"/>
-      <w:r>
-        <w:t xml:space="preserve"> Failed to Create</w:t>
-      </w:r>
-    </w:p>
-    <w:p>
-      <w:pPr>
-        <w:spacing w:after="120"/>
-      </w:pPr>
-      <w:r>
-        <w:t xml:space="preserve">If the </w:t>
-      </w:r>
-      <w:proofErr w:type="spellStart"/>
-      <w:r>
-        <w:t>DataPowerService</w:t>
-      </w:r>
-      <w:proofErr w:type="spellEnd"/>
-      <w:r>
-        <w:t xml:space="preserve"> does not come up, check the following:</w:t>
-      </w:r>
-    </w:p>
-    <w:p>
-      <w:pPr>
-        <w:spacing w:after="200"/>
-      </w:pPr>
-      <w:r>
-        <w:t xml:space="preserve"> </w:t>
-      </w:r>
-    </w:p>
-    <w:p>
-      <w:pPr>
-        <w:spacing w:after="120"/>
-      </w:pPr>
-      <w:r>
-        <w:rPr>
-          <w:b/>
-          <w:bCs/>
-        </w:rPr>
-        <w:t>1. Check the pod status and events:</w:t>
-      </w:r>
-    </w:p>
-    <w:p>
-      <w:pPr>
-        <w:spacing w:after="200"/>
-      </w:pPr>
-      <w:r>
-        <w:t xml:space="preserve"> </w:t>
-      </w:r>
-    </w:p>
-    <w:p>
-      <w:pPr>
-        <w:shd w:val="clear" w:color="auto" w:fill="000000"/>
-        <w:spacing w:before="160" w:after="200"/>
-        <w:ind w:left="240" w:right="240"/>
-      </w:pPr>
-      <w:r>
-        <w:rPr>
-          <w:rFonts w:ascii="Courier New" w:eastAsia="Courier New" w:hAnsi="Courier New" w:cs="Courier New"/>
-          <w:color w:val="FFFFFF"/>
-          <w:sz w:val="20"/>
-          <w:szCs w:val="20"/>
-        </w:rPr>
-        <w:t xml:space="preserve">         </w:t>
-      </w:r>
-      <w:r>
-        <w:br/>
-      </w:r>
-      <w:r>
-        <w:rPr>
-          <w:rFonts w:ascii="Courier New" w:eastAsia="Courier New" w:hAnsi="Courier New" w:cs="Courier New"/>
-          <w:color w:val="FFFFFF"/>
-          <w:sz w:val="20"/>
-          <w:szCs w:val="20"/>
-        </w:rPr>
-        <w:t xml:space="preserve">    </w:t>
-      </w:r>
-      <w:proofErr w:type="spellStart"/>
-      <w:r>
-        <w:rPr>
-          <w:rFonts w:ascii="Courier New" w:eastAsia="Courier New" w:hAnsi="Courier New" w:cs="Courier New"/>
-          <w:color w:val="FFFFFF"/>
-          <w:sz w:val="20"/>
-          <w:szCs w:val="20"/>
-        </w:rPr>
-        <w:t>oc</w:t>
-      </w:r>
-      <w:proofErr w:type="spellEnd"/>
-      <w:r>
-        <w:rPr>
-          <w:rFonts w:ascii="Courier New" w:eastAsia="Courier New" w:hAnsi="Courier New" w:cs="Courier New"/>
-          <w:color w:val="FFFFFF"/>
-          <w:sz w:val="20"/>
-          <w:szCs w:val="20"/>
-        </w:rPr>
-        <w:t xml:space="preserve"> get pods -n </w:t>
-      </w:r>
-      <w:proofErr w:type="spellStart"/>
-      <w:r>
-        <w:rPr>
-          <w:rFonts w:ascii="Courier New" w:eastAsia="Courier New" w:hAnsi="Courier New" w:cs="Courier New"/>
-          <w:color w:val="FFFFFF"/>
-          <w:sz w:val="20"/>
-          <w:szCs w:val="20"/>
-        </w:rPr>
-        <w:t>nfcu</w:t>
-      </w:r>
-      <w:proofErr w:type="spellEnd"/>
-      <w:r>
-        <w:rPr>
-          <w:rFonts w:ascii="Courier New" w:eastAsia="Courier New" w:hAnsi="Courier New" w:cs="Courier New"/>
-          <w:color w:val="FFFFFF"/>
-          <w:sz w:val="20"/>
-          <w:szCs w:val="20"/>
-        </w:rPr>
-        <w:t xml:space="preserve">-demo    </w:t>
-      </w:r>
-      <w:r>
-        <w:br/>
-      </w:r>
-      <w:r>
-        <w:rPr>
-          <w:rFonts w:ascii="Courier New" w:eastAsia="Courier New" w:hAnsi="Courier New" w:cs="Courier New"/>
-          <w:color w:val="FFFFFF"/>
-          <w:sz w:val="20"/>
-          <w:szCs w:val="20"/>
-        </w:rPr>
-        <w:t xml:space="preserve">    </w:t>
-      </w:r>
-      <w:proofErr w:type="spellStart"/>
-      <w:r>
-        <w:rPr>
-          <w:rFonts w:ascii="Courier New" w:eastAsia="Courier New" w:hAnsi="Courier New" w:cs="Courier New"/>
-          <w:color w:val="FFFFFF"/>
-          <w:sz w:val="20"/>
-          <w:szCs w:val="20"/>
-        </w:rPr>
-        <w:t>oc</w:t>
-      </w:r>
-      <w:proofErr w:type="spellEnd"/>
-      <w:r>
-        <w:rPr>
-          <w:rFonts w:ascii="Courier New" w:eastAsia="Courier New" w:hAnsi="Courier New" w:cs="Courier New"/>
-          <w:color w:val="FFFFFF"/>
-          <w:sz w:val="20"/>
-          <w:szCs w:val="20"/>
-        </w:rPr>
-        <w:t xml:space="preserve"> describe pod quickstart-0 -n </w:t>
-      </w:r>
-      <w:proofErr w:type="spellStart"/>
-      <w:r>
-        <w:rPr>
-          <w:rFonts w:ascii="Courier New" w:eastAsia="Courier New" w:hAnsi="Courier New" w:cs="Courier New"/>
-          <w:color w:val="FFFFFF"/>
-          <w:sz w:val="20"/>
-          <w:szCs w:val="20"/>
-        </w:rPr>
-        <w:t>nfcu</w:t>
-      </w:r>
-      <w:proofErr w:type="spellEnd"/>
-      <w:r>
-        <w:rPr>
-          <w:rFonts w:ascii="Courier New" w:eastAsia="Courier New" w:hAnsi="Courier New" w:cs="Courier New"/>
-          <w:color w:val="FFFFFF"/>
-          <w:sz w:val="20"/>
-          <w:szCs w:val="20"/>
-        </w:rPr>
-        <w:t xml:space="preserve">-demo    </w:t>
-      </w:r>
-      <w:r>
-        <w:br/>
-      </w:r>
-      <w:r>
-        <w:rPr>
-          <w:rFonts w:ascii="Courier New" w:eastAsia="Courier New" w:hAnsi="Courier New" w:cs="Courier New"/>
-          <w:color w:val="FFFFFF"/>
-          <w:sz w:val="20"/>
-          <w:szCs w:val="20"/>
-        </w:rPr>
-        <w:t xml:space="preserve">         </w:t>
-      </w:r>
-    </w:p>
-    <w:p>
-      <w:pPr>
-        <w:spacing w:after="200"/>
-      </w:pPr>
-      <w:r>
-        <w:t xml:space="preserve"> </w:t>
-      </w:r>
-    </w:p>
-    <w:p>
-      <w:pPr>
-        <w:spacing w:after="120"/>
-      </w:pPr>
-      <w:r>
-        <w:t xml:space="preserve">Look at the </w:t>
-      </w:r>
-      <w:r>
-        <w:rPr>
-          <w:b/>
-          <w:bCs/>
-        </w:rPr>
-        <w:t>Events</w:t>
-      </w:r>
-      <w:r>
-        <w:t xml:space="preserve"> section at the bottom of the </w:t>
-      </w:r>
-      <w:r>
-        <w:rPr>
-          <w:rFonts w:ascii="Courier New" w:eastAsia="Courier New" w:hAnsi="Courier New" w:cs="Courier New"/>
-          <w:shd w:val="clear" w:color="auto" w:fill="F1F5F9"/>
-        </w:rPr>
-        <w:t>describe</w:t>
-      </w:r>
-      <w:r>
-        <w:t xml:space="preserve"> output — it will show pull errors, scheduling failures, or config issues.</w:t>
-      </w:r>
-    </w:p>
-    <w:p>
-      <w:pPr>
-        <w:spacing w:after="200"/>
-      </w:pPr>
-      <w:r>
-        <w:t xml:space="preserve"> </w:t>
-      </w:r>
-    </w:p>
-    <w:p>
-      <w:pPr>
-        <w:spacing w:after="120"/>
-      </w:pPr>
-      <w:r>
-        <w:rPr>
-          <w:b/>
-          <w:bCs/>
-        </w:rPr>
-        <w:t xml:space="preserve">2. Check the </w:t>
-      </w:r>
-      <w:proofErr w:type="spellStart"/>
-      <w:r>
-        <w:rPr>
-          <w:b/>
-          <w:bCs/>
-        </w:rPr>
-        <w:t>DataPowerService</w:t>
-      </w:r>
-      <w:proofErr w:type="spellEnd"/>
-      <w:r>
-        <w:rPr>
-          <w:b/>
-          <w:bCs/>
-        </w:rPr>
-        <w:t xml:space="preserve"> resource status:</w:t>
-      </w:r>
-    </w:p>
-    <w:p>
-      <w:pPr>
-        <w:spacing w:after="200"/>
-      </w:pPr>
-      <w:r>
-        <w:t xml:space="preserve"> </w:t>
-      </w:r>
-    </w:p>
-    <w:p>
-      <w:pPr>
-        <w:shd w:val="clear" w:color="auto" w:fill="000000"/>
-        <w:spacing w:before="160" w:after="200"/>
-        <w:ind w:left="240" w:right="240"/>
-      </w:pPr>
-      <w:r>
-        <w:rPr>
-          <w:rFonts w:ascii="Courier New" w:eastAsia="Courier New" w:hAnsi="Courier New" w:cs="Courier New"/>
-          <w:color w:val="FFFFFF"/>
-          <w:sz w:val="20"/>
-          <w:szCs w:val="20"/>
-        </w:rPr>
-        <w:t xml:space="preserve">         </w:t>
-      </w:r>
-      <w:r>
-        <w:br/>
-      </w:r>
-      <w:r>
-        <w:rPr>
-          <w:rFonts w:ascii="Courier New" w:eastAsia="Courier New" w:hAnsi="Courier New" w:cs="Courier New"/>
-          <w:color w:val="FFFFFF"/>
-          <w:sz w:val="20"/>
-          <w:szCs w:val="20"/>
-        </w:rPr>
-        <w:t xml:space="preserve">    </w:t>
-      </w:r>
-      <w:proofErr w:type="spellStart"/>
-      <w:r>
-        <w:rPr>
-          <w:rFonts w:ascii="Courier New" w:eastAsia="Courier New" w:hAnsi="Courier New" w:cs="Courier New"/>
-          <w:color w:val="FFFFFF"/>
-          <w:sz w:val="20"/>
-          <w:szCs w:val="20"/>
-        </w:rPr>
-        <w:t>oc</w:t>
-      </w:r>
-      <w:proofErr w:type="spellEnd"/>
-      <w:r>
-        <w:rPr>
-          <w:rFonts w:ascii="Courier New" w:eastAsia="Courier New" w:hAnsi="Courier New" w:cs="Courier New"/>
-          <w:color w:val="FFFFFF"/>
-          <w:sz w:val="20"/>
-          <w:szCs w:val="20"/>
-        </w:rPr>
-        <w:t xml:space="preserve"> describe </w:t>
-      </w:r>
-      <w:proofErr w:type="spellStart"/>
-      <w:r>
-        <w:rPr>
-          <w:rFonts w:ascii="Courier New" w:eastAsia="Courier New" w:hAnsi="Courier New" w:cs="Courier New"/>
-          <w:color w:val="FFFFFF"/>
-          <w:sz w:val="20"/>
-          <w:szCs w:val="20"/>
-        </w:rPr>
-        <w:t>datapowerservice</w:t>
-      </w:r>
-      <w:proofErr w:type="spellEnd"/>
-      <w:r>
-        <w:rPr>
-          <w:rFonts w:ascii="Courier New" w:eastAsia="Courier New" w:hAnsi="Courier New" w:cs="Courier New"/>
-          <w:color w:val="FFFFFF"/>
-          <w:sz w:val="20"/>
-          <w:szCs w:val="20"/>
-        </w:rPr>
-        <w:t xml:space="preserve"> </w:t>
-      </w:r>
-      <w:proofErr w:type="spellStart"/>
-      <w:r>
-        <w:rPr>
-          <w:rFonts w:ascii="Courier New" w:eastAsia="Courier New" w:hAnsi="Courier New" w:cs="Courier New"/>
-          <w:color w:val="FFFFFF"/>
-          <w:sz w:val="20"/>
-          <w:szCs w:val="20"/>
-        </w:rPr>
-        <w:t>quickstart</w:t>
-      </w:r>
-      <w:proofErr w:type="spellEnd"/>
-      <w:r>
-        <w:rPr>
-          <w:rFonts w:ascii="Courier New" w:eastAsia="Courier New" w:hAnsi="Courier New" w:cs="Courier New"/>
-          <w:color w:val="FFFFFF"/>
-          <w:sz w:val="20"/>
-          <w:szCs w:val="20"/>
-        </w:rPr>
-        <w:t xml:space="preserve"> -n </w:t>
-      </w:r>
-      <w:proofErr w:type="spellStart"/>
-      <w:r>
-        <w:rPr>
-          <w:rFonts w:ascii="Courier New" w:eastAsia="Courier New" w:hAnsi="Courier New" w:cs="Courier New"/>
-          <w:color w:val="FFFFFF"/>
-          <w:sz w:val="20"/>
-          <w:szCs w:val="20"/>
-        </w:rPr>
-        <w:t>nfcu</w:t>
-      </w:r>
-      <w:proofErr w:type="spellEnd"/>
-      <w:r>
-        <w:rPr>
-          <w:rFonts w:ascii="Courier New" w:eastAsia="Courier New" w:hAnsi="Courier New" w:cs="Courier New"/>
-          <w:color w:val="FFFFFF"/>
-          <w:sz w:val="20"/>
-          <w:szCs w:val="20"/>
-        </w:rPr>
-        <w:t xml:space="preserve">-demo    </w:t>
-      </w:r>
-      <w:r>
-        <w:br/>
-      </w:r>
-      <w:r>
-        <w:rPr>
-          <w:rFonts w:ascii="Courier New" w:eastAsia="Courier New" w:hAnsi="Courier New" w:cs="Courier New"/>
-          <w:color w:val="FFFFFF"/>
-          <w:sz w:val="20"/>
-          <w:szCs w:val="20"/>
-        </w:rPr>
-        <w:t xml:space="preserve">         </w:t>
-      </w:r>
-    </w:p>
-    <w:p>
-      <w:pPr>
-        <w:spacing w:after="200"/>
-      </w:pPr>
-      <w:r>
-        <w:lastRenderedPageBreak/>
-        <w:t xml:space="preserve"> </w:t>
-      </w:r>
-    </w:p>
-    <w:p>
-      <w:pPr>
-        <w:spacing w:after="120"/>
-      </w:pPr>
-      <w:r>
-        <w:t xml:space="preserve">Look for any status conditions or error messages under </w:t>
-      </w:r>
-      <w:r>
-        <w:rPr>
-          <w:b/>
-          <w:bCs/>
-        </w:rPr>
-        <w:t>Status</w:t>
-      </w:r>
-      <w:r>
-        <w:t>.</w:t>
-      </w:r>
-    </w:p>
-    <w:p>
-      <w:pPr>
-        <w:spacing w:after="200"/>
-      </w:pPr>
-      <w:r>
-        <w:t xml:space="preserve"> </w:t>
-      </w:r>
-    </w:p>
-    <w:p>
-      <w:pPr>
-        <w:spacing w:after="120"/>
-      </w:pPr>
-      <w:r>
-        <w:rPr>
-          <w:b/>
-          <w:bCs/>
-        </w:rPr>
-        <w:t>3. Check the operator logs:</w:t>
-      </w:r>
-    </w:p>
-    <w:p>
-      <w:pPr>
-        <w:spacing w:after="200"/>
-      </w:pPr>
-      <w:r>
-        <w:t xml:space="preserve"> </w:t>
-      </w:r>
-    </w:p>
-    <w:p>
-      <w:pPr>
-        <w:shd w:val="clear" w:color="auto" w:fill="000000"/>
-        <w:spacing w:before="160" w:after="200"/>
-        <w:ind w:left="240" w:right="240"/>
-      </w:pPr>
-      <w:r>
-        <w:rPr>
-          <w:rFonts w:ascii="Courier New" w:eastAsia="Courier New" w:hAnsi="Courier New" w:cs="Courier New"/>
-          <w:color w:val="FFFFFF"/>
-          <w:sz w:val="20"/>
-          <w:szCs w:val="20"/>
-        </w:rPr>
-        <w:t xml:space="preserve">         </w:t>
-      </w:r>
-      <w:r>
-        <w:br/>
-      </w:r>
-      <w:r>
-        <w:rPr>
-          <w:rFonts w:ascii="Courier New" w:eastAsia="Courier New" w:hAnsi="Courier New" w:cs="Courier New"/>
-          <w:color w:val="FFFFFF"/>
-          <w:sz w:val="20"/>
-          <w:szCs w:val="20"/>
-        </w:rPr>
-        <w:t xml:space="preserve">    </w:t>
-      </w:r>
-      <w:proofErr w:type="spellStart"/>
-      <w:r>
-        <w:rPr>
-          <w:rFonts w:ascii="Courier New" w:eastAsia="Courier New" w:hAnsi="Courier New" w:cs="Courier New"/>
-          <w:color w:val="FFFFFF"/>
-          <w:sz w:val="20"/>
-          <w:szCs w:val="20"/>
-        </w:rPr>
-        <w:t>oc</w:t>
-      </w:r>
-      <w:proofErr w:type="spellEnd"/>
-      <w:r>
-        <w:rPr>
-          <w:rFonts w:ascii="Courier New" w:eastAsia="Courier New" w:hAnsi="Courier New" w:cs="Courier New"/>
-          <w:color w:val="FFFFFF"/>
-          <w:sz w:val="20"/>
-          <w:szCs w:val="20"/>
-        </w:rPr>
-        <w:t xml:space="preserve"> logs -n </w:t>
-      </w:r>
-      <w:proofErr w:type="spellStart"/>
-      <w:r>
-        <w:rPr>
-          <w:rFonts w:ascii="Courier New" w:eastAsia="Courier New" w:hAnsi="Courier New" w:cs="Courier New"/>
-          <w:color w:val="FFFFFF"/>
-          <w:sz w:val="20"/>
-          <w:szCs w:val="20"/>
-        </w:rPr>
-        <w:t>openshift</w:t>
-      </w:r>
-      <w:proofErr w:type="spellEnd"/>
-      <w:r>
-        <w:rPr>
-          <w:rFonts w:ascii="Courier New" w:eastAsia="Courier New" w:hAnsi="Courier New" w:cs="Courier New"/>
-          <w:color w:val="FFFFFF"/>
-          <w:sz w:val="20"/>
-          <w:szCs w:val="20"/>
-        </w:rPr>
-        <w:t>-operators -l name=</w:t>
-      </w:r>
-      <w:proofErr w:type="spellStart"/>
-      <w:r>
-        <w:rPr>
-          <w:rFonts w:ascii="Courier New" w:eastAsia="Courier New" w:hAnsi="Courier New" w:cs="Courier New"/>
-          <w:color w:val="FFFFFF"/>
-          <w:sz w:val="20"/>
-          <w:szCs w:val="20"/>
-        </w:rPr>
-        <w:t>datapower</w:t>
-      </w:r>
-      <w:proofErr w:type="spellEnd"/>
-      <w:r>
-        <w:rPr>
-          <w:rFonts w:ascii="Courier New" w:eastAsia="Courier New" w:hAnsi="Courier New" w:cs="Courier New"/>
-          <w:color w:val="FFFFFF"/>
-          <w:sz w:val="20"/>
-          <w:szCs w:val="20"/>
-        </w:rPr>
-        <w:t xml:space="preserve">-operator    </w:t>
-      </w:r>
-      <w:r>
-        <w:br/>
-      </w:r>
-      <w:r>
-        <w:rPr>
-          <w:rFonts w:ascii="Courier New" w:eastAsia="Courier New" w:hAnsi="Courier New" w:cs="Courier New"/>
-          <w:color w:val="FFFFFF"/>
-          <w:sz w:val="20"/>
-          <w:szCs w:val="20"/>
-        </w:rPr>
-        <w:t xml:space="preserve">         </w:t>
-      </w:r>
-    </w:p>
-    <w:p>
-      <w:pPr>
-        <w:spacing w:after="200"/>
-      </w:pPr>
-      <w:r>
-        <w:t xml:space="preserve"> </w:t>
-      </w:r>
-    </w:p>
-    <w:p>
-      <w:pPr>
-        <w:spacing w:after="120"/>
-      </w:pPr>
-      <w:r>
-        <w:t>The operator is responsible for creating the pod — its logs will show any reconciliation errors.</w:t>
-      </w:r>
-    </w:p>
-    <w:p>
-      <w:pPr>
-        <w:spacing w:after="200"/>
-      </w:pPr>
-      <w:r>
-        <w:t xml:space="preserve"> </w:t>
-      </w:r>
-    </w:p>
-    <w:p>
-      <w:pPr>
-        <w:spacing w:after="120"/>
-      </w:pPr>
-      <w:r>
-        <w:rPr>
-          <w:b/>
-          <w:bCs/>
-        </w:rPr>
-        <w:t>4. Check for image pull errors:</w:t>
-      </w:r>
-    </w:p>
-    <w:p>
-      <w:pPr>
-        <w:spacing w:after="200"/>
-      </w:pPr>
-      <w:r>
-        <w:t xml:space="preserve"> </w:t>
-      </w:r>
-    </w:p>
-    <w:p>
-      <w:pPr>
-        <w:spacing w:after="120"/>
-      </w:pPr>
-      <w:r>
-        <w:t xml:space="preserve">If the pod is stuck in </w:t>
-      </w:r>
-      <w:proofErr w:type="spellStart"/>
-      <w:r>
-        <w:rPr>
-          <w:rFonts w:ascii="Courier New" w:eastAsia="Courier New" w:hAnsi="Courier New" w:cs="Courier New"/>
-          <w:shd w:val="clear" w:color="auto" w:fill="F1F5F9"/>
-        </w:rPr>
-        <w:t>ImagePullBackOff</w:t>
-      </w:r>
-      <w:proofErr w:type="spellEnd"/>
-      <w:r>
-        <w:t xml:space="preserve"> or </w:t>
-      </w:r>
-      <w:proofErr w:type="spellStart"/>
-      <w:r>
-        <w:rPr>
-          <w:rFonts w:ascii="Courier New" w:eastAsia="Courier New" w:hAnsi="Courier New" w:cs="Courier New"/>
-          <w:shd w:val="clear" w:color="auto" w:fill="F1F5F9"/>
-        </w:rPr>
-        <w:t>ErrImagePull</w:t>
-      </w:r>
-      <w:proofErr w:type="spellEnd"/>
-      <w:r>
-        <w:t>, the IBM entitlement secret is likely missing or not linked. Verify with:</w:t>
-      </w:r>
-    </w:p>
-    <w:p>
-      <w:pPr>
-        <w:spacing w:after="200"/>
-      </w:pPr>
-      <w:r>
-        <w:t xml:space="preserve"> </w:t>
-      </w:r>
-    </w:p>
-    <w:p>
-      <w:pPr>
-        <w:shd w:val="clear" w:color="auto" w:fill="000000"/>
-        <w:spacing w:before="160" w:after="200"/>
-        <w:ind w:left="240" w:right="240"/>
-      </w:pPr>
-      <w:r>
-        <w:rPr>
-          <w:rFonts w:ascii="Courier New" w:eastAsia="Courier New" w:hAnsi="Courier New" w:cs="Courier New"/>
-          <w:color w:val="FFFFFF"/>
-          <w:sz w:val="20"/>
-          <w:szCs w:val="20"/>
-        </w:rPr>
-        <w:t xml:space="preserve">         </w:t>
-      </w:r>
-      <w:r>
-        <w:br/>
-      </w:r>
-      <w:r>
-        <w:rPr>
-          <w:rFonts w:ascii="Courier New" w:eastAsia="Courier New" w:hAnsi="Courier New" w:cs="Courier New"/>
-          <w:color w:val="FFFFFF"/>
-          <w:sz w:val="20"/>
-          <w:szCs w:val="20"/>
-        </w:rPr>
-        <w:t xml:space="preserve">    </w:t>
-      </w:r>
-      <w:proofErr w:type="spellStart"/>
-      <w:r>
-        <w:rPr>
-          <w:rFonts w:ascii="Courier New" w:eastAsia="Courier New" w:hAnsi="Courier New" w:cs="Courier New"/>
-          <w:color w:val="FFFFFF"/>
-          <w:sz w:val="20"/>
-          <w:szCs w:val="20"/>
-        </w:rPr>
-        <w:t>oc</w:t>
-      </w:r>
-      <w:proofErr w:type="spellEnd"/>
-      <w:r>
-        <w:rPr>
-          <w:rFonts w:ascii="Courier New" w:eastAsia="Courier New" w:hAnsi="Courier New" w:cs="Courier New"/>
-          <w:color w:val="FFFFFF"/>
-          <w:sz w:val="20"/>
-          <w:szCs w:val="20"/>
-        </w:rPr>
-        <w:t xml:space="preserve"> get secret </w:t>
-      </w:r>
-      <w:proofErr w:type="spellStart"/>
-      <w:r>
-        <w:rPr>
-          <w:rFonts w:ascii="Courier New" w:eastAsia="Courier New" w:hAnsi="Courier New" w:cs="Courier New"/>
-          <w:color w:val="FFFFFF"/>
-          <w:sz w:val="20"/>
-          <w:szCs w:val="20"/>
-        </w:rPr>
-        <w:t>ibm</w:t>
-      </w:r>
-      <w:proofErr w:type="spellEnd"/>
-      <w:r>
-        <w:rPr>
-          <w:rFonts w:ascii="Courier New" w:eastAsia="Courier New" w:hAnsi="Courier New" w:cs="Courier New"/>
-          <w:color w:val="FFFFFF"/>
-          <w:sz w:val="20"/>
-          <w:szCs w:val="20"/>
-        </w:rPr>
-        <w:t xml:space="preserve">-entitlement-key -n </w:t>
-      </w:r>
-      <w:proofErr w:type="spellStart"/>
-      <w:r>
-        <w:rPr>
-          <w:rFonts w:ascii="Courier New" w:eastAsia="Courier New" w:hAnsi="Courier New" w:cs="Courier New"/>
-          <w:color w:val="FFFFFF"/>
-          <w:sz w:val="20"/>
-          <w:szCs w:val="20"/>
-        </w:rPr>
-        <w:t>nfcu</w:t>
-      </w:r>
-      <w:proofErr w:type="spellEnd"/>
-      <w:r>
-        <w:rPr>
-          <w:rFonts w:ascii="Courier New" w:eastAsia="Courier New" w:hAnsi="Courier New" w:cs="Courier New"/>
-          <w:color w:val="FFFFFF"/>
-          <w:sz w:val="20"/>
-          <w:szCs w:val="20"/>
-        </w:rPr>
-        <w:t xml:space="preserve">-demo    </w:t>
-      </w:r>
-      <w:r>
-        <w:br/>
-      </w:r>
-      <w:r>
-        <w:rPr>
-          <w:rFonts w:ascii="Courier New" w:eastAsia="Courier New" w:hAnsi="Courier New" w:cs="Courier New"/>
-          <w:color w:val="FFFFFF"/>
-          <w:sz w:val="20"/>
-          <w:szCs w:val="20"/>
-        </w:rPr>
-        <w:t xml:space="preserve">    </w:t>
-      </w:r>
-      <w:proofErr w:type="spellStart"/>
-      <w:r>
-        <w:rPr>
-          <w:rFonts w:ascii="Courier New" w:eastAsia="Courier New" w:hAnsi="Courier New" w:cs="Courier New"/>
-          <w:color w:val="FFFFFF"/>
-          <w:sz w:val="20"/>
-          <w:szCs w:val="20"/>
-        </w:rPr>
-        <w:t>oc</w:t>
-      </w:r>
-      <w:proofErr w:type="spellEnd"/>
-      <w:r>
-        <w:rPr>
-          <w:rFonts w:ascii="Courier New" w:eastAsia="Courier New" w:hAnsi="Courier New" w:cs="Courier New"/>
-          <w:color w:val="FFFFFF"/>
-          <w:sz w:val="20"/>
-          <w:szCs w:val="20"/>
-        </w:rPr>
-        <w:t xml:space="preserve"> get </w:t>
-      </w:r>
-      <w:proofErr w:type="spellStart"/>
-      <w:r>
-        <w:rPr>
-          <w:rFonts w:ascii="Courier New" w:eastAsia="Courier New" w:hAnsi="Courier New" w:cs="Courier New"/>
-          <w:color w:val="FFFFFF"/>
-          <w:sz w:val="20"/>
-          <w:szCs w:val="20"/>
-        </w:rPr>
-        <w:t>serviceaccount</w:t>
-      </w:r>
-      <w:proofErr w:type="spellEnd"/>
-      <w:r>
-        <w:rPr>
-          <w:rFonts w:ascii="Courier New" w:eastAsia="Courier New" w:hAnsi="Courier New" w:cs="Courier New"/>
-          <w:color w:val="FFFFFF"/>
-          <w:sz w:val="20"/>
-          <w:szCs w:val="20"/>
-        </w:rPr>
-        <w:t xml:space="preserve"> default -n </w:t>
-      </w:r>
-      <w:proofErr w:type="spellStart"/>
-      <w:r>
-        <w:rPr>
-          <w:rFonts w:ascii="Courier New" w:eastAsia="Courier New" w:hAnsi="Courier New" w:cs="Courier New"/>
-          <w:color w:val="FFFFFF"/>
-          <w:sz w:val="20"/>
-          <w:szCs w:val="20"/>
-        </w:rPr>
-        <w:t>nfcu</w:t>
-      </w:r>
-      <w:proofErr w:type="spellEnd"/>
-      <w:r>
-        <w:rPr>
-          <w:rFonts w:ascii="Courier New" w:eastAsia="Courier New" w:hAnsi="Courier New" w:cs="Courier New"/>
-          <w:color w:val="FFFFFF"/>
-          <w:sz w:val="20"/>
-          <w:szCs w:val="20"/>
-        </w:rPr>
-        <w:t xml:space="preserve">-demo -o </w:t>
-      </w:r>
-      <w:proofErr w:type="spellStart"/>
-      <w:r>
-        <w:rPr>
-          <w:rFonts w:ascii="Courier New" w:eastAsia="Courier New" w:hAnsi="Courier New" w:cs="Courier New"/>
-          <w:color w:val="FFFFFF"/>
-          <w:sz w:val="20"/>
-          <w:szCs w:val="20"/>
-        </w:rPr>
-        <w:t>yaml</w:t>
-      </w:r>
-      <w:proofErr w:type="spellEnd"/>
-      <w:r>
-        <w:rPr>
-          <w:rFonts w:ascii="Courier New" w:eastAsia="Courier New" w:hAnsi="Courier New" w:cs="Courier New"/>
-          <w:color w:val="FFFFFF"/>
-          <w:sz w:val="20"/>
-          <w:szCs w:val="20"/>
-        </w:rPr>
-        <w:t xml:space="preserve"> | grep </w:t>
-      </w:r>
-      <w:proofErr w:type="spellStart"/>
-      <w:r>
-        <w:rPr>
-          <w:rFonts w:ascii="Courier New" w:eastAsia="Courier New" w:hAnsi="Courier New" w:cs="Courier New"/>
-          <w:color w:val="FFFFFF"/>
-          <w:sz w:val="20"/>
-          <w:szCs w:val="20"/>
-        </w:rPr>
-        <w:t>ibm</w:t>
-      </w:r>
-      <w:proofErr w:type="spellEnd"/>
-      <w:r>
-        <w:rPr>
-          <w:rFonts w:ascii="Courier New" w:eastAsia="Courier New" w:hAnsi="Courier New" w:cs="Courier New"/>
-          <w:color w:val="FFFFFF"/>
-          <w:sz w:val="20"/>
-          <w:szCs w:val="20"/>
-        </w:rPr>
-        <w:t xml:space="preserve">-entitlement-key    </w:t>
-      </w:r>
-      <w:r>
-        <w:br/>
-      </w:r>
-      <w:r>
-        <w:rPr>
-          <w:rFonts w:ascii="Courier New" w:eastAsia="Courier New" w:hAnsi="Courier New" w:cs="Courier New"/>
-          <w:color w:val="FFFFFF"/>
-          <w:sz w:val="20"/>
-          <w:szCs w:val="20"/>
-        </w:rPr>
-        <w:t xml:space="preserve">         </w:t>
-      </w:r>
-    </w:p>
-    <w:p>
-      <w:pPr>
-        <w:spacing w:after="200"/>
-      </w:pPr>
-      <w:r>
-        <w:t xml:space="preserve"> </w:t>
-      </w:r>
-    </w:p>
-    <w:p>
-      <w:pPr>
-        <w:spacing w:after="120"/>
-      </w:pPr>
-      <w:r>
-        <w:rPr>
-          <w:b/>
-          <w:bCs/>
-        </w:rPr>
-        <w:t xml:space="preserve">5. Check for missing secrets or </w:t>
-      </w:r>
-      <w:proofErr w:type="spellStart"/>
-      <w:r>
-        <w:rPr>
-          <w:b/>
-          <w:bCs/>
-        </w:rPr>
-        <w:t>ConfigMaps</w:t>
-      </w:r>
-      <w:proofErr w:type="spellEnd"/>
-      <w:r>
-        <w:rPr>
-          <w:b/>
-          <w:bCs/>
-        </w:rPr>
-        <w:t>:</w:t>
-      </w:r>
-    </w:p>
-    <w:p>
-      <w:pPr>
-        <w:spacing w:after="200"/>
-      </w:pPr>
-      <w:r>
-        <w:t xml:space="preserve"> </w:t>
-      </w:r>
-    </w:p>
-    <w:p>
-      <w:pPr>
-        <w:spacing w:after="120"/>
-      </w:pPr>
-      <w:r>
-        <w:t xml:space="preserve">If the pod fails with a mount error, a referenced secret or </w:t>
-      </w:r>
-      <w:proofErr w:type="spellStart"/>
-      <w:r>
-        <w:t>ConfigMap</w:t>
-      </w:r>
-      <w:proofErr w:type="spellEnd"/>
-      <w:r>
-        <w:t xml:space="preserve"> may not exist. Verify all required resources from Lab 4 are present:</w:t>
-      </w:r>
-    </w:p>
-    <w:p>
-      <w:pPr>
-        <w:spacing w:after="200"/>
-      </w:pPr>
-      <w:r>
-        <w:t xml:space="preserve"> </w:t>
-      </w:r>
-    </w:p>
-    <w:p>
-      <w:pPr>
-        <w:shd w:val="clear" w:color="auto" w:fill="000000"/>
-        <w:spacing w:before="160" w:after="200"/>
-        <w:ind w:left="240" w:right="240"/>
-      </w:pPr>
-      <w:r>
-        <w:rPr>
-          <w:rFonts w:ascii="Courier New" w:eastAsia="Courier New" w:hAnsi="Courier New" w:cs="Courier New"/>
-          <w:color w:val="FFFFFF"/>
-          <w:sz w:val="20"/>
-          <w:szCs w:val="20"/>
-        </w:rPr>
-        <w:t xml:space="preserve">         </w:t>
-      </w:r>
-      <w:r>
-        <w:br/>
-      </w:r>
-      <w:r>
-        <w:rPr>
-          <w:rFonts w:ascii="Courier New" w:eastAsia="Courier New" w:hAnsi="Courier New" w:cs="Courier New"/>
-          <w:color w:val="FFFFFF"/>
-          <w:sz w:val="20"/>
-          <w:szCs w:val="20"/>
-        </w:rPr>
-        <w:t xml:space="preserve">    </w:t>
-      </w:r>
-      <w:proofErr w:type="spellStart"/>
-      <w:r>
-        <w:rPr>
-          <w:rFonts w:ascii="Courier New" w:eastAsia="Courier New" w:hAnsi="Courier New" w:cs="Courier New"/>
-          <w:color w:val="FFFFFF"/>
-          <w:sz w:val="20"/>
-          <w:szCs w:val="20"/>
-        </w:rPr>
-        <w:t>oc</w:t>
-      </w:r>
-      <w:proofErr w:type="spellEnd"/>
-      <w:r>
-        <w:rPr>
-          <w:rFonts w:ascii="Courier New" w:eastAsia="Courier New" w:hAnsi="Courier New" w:cs="Courier New"/>
-          <w:color w:val="FFFFFF"/>
-          <w:sz w:val="20"/>
-          <w:szCs w:val="20"/>
-        </w:rPr>
-        <w:t xml:space="preserve"> get </w:t>
-      </w:r>
-      <w:proofErr w:type="spellStart"/>
-      <w:proofErr w:type="gramStart"/>
-      <w:r>
-        <w:rPr>
-          <w:rFonts w:ascii="Courier New" w:eastAsia="Courier New" w:hAnsi="Courier New" w:cs="Courier New"/>
-          <w:color w:val="FFFFFF"/>
-          <w:sz w:val="20"/>
-          <w:szCs w:val="20"/>
-        </w:rPr>
-        <w:t>secret,configmap</w:t>
-      </w:r>
-      <w:proofErr w:type="spellEnd"/>
-      <w:proofErr w:type="gramEnd"/>
-      <w:r>
-        <w:rPr>
-          <w:rFonts w:ascii="Courier New" w:eastAsia="Courier New" w:hAnsi="Courier New" w:cs="Courier New"/>
-          <w:color w:val="FFFFFF"/>
-          <w:sz w:val="20"/>
-          <w:szCs w:val="20"/>
-        </w:rPr>
-        <w:t xml:space="preserve"> -n </w:t>
-      </w:r>
-      <w:proofErr w:type="spellStart"/>
-      <w:r>
-        <w:rPr>
-          <w:rFonts w:ascii="Courier New" w:eastAsia="Courier New" w:hAnsi="Courier New" w:cs="Courier New"/>
-          <w:color w:val="FFFFFF"/>
-          <w:sz w:val="20"/>
-          <w:szCs w:val="20"/>
-        </w:rPr>
-        <w:t>nfcu</w:t>
-      </w:r>
-      <w:proofErr w:type="spellEnd"/>
-      <w:r>
-        <w:rPr>
-          <w:rFonts w:ascii="Courier New" w:eastAsia="Courier New" w:hAnsi="Courier New" w:cs="Courier New"/>
-          <w:color w:val="FFFFFF"/>
-          <w:sz w:val="20"/>
-          <w:szCs w:val="20"/>
-        </w:rPr>
-        <w:t xml:space="preserve">-demo    </w:t>
-      </w:r>
-      <w:r>
-        <w:br/>
-      </w:r>
-      <w:r>
-        <w:rPr>
-          <w:rFonts w:ascii="Courier New" w:eastAsia="Courier New" w:hAnsi="Courier New" w:cs="Courier New"/>
-          <w:color w:val="FFFFFF"/>
-          <w:sz w:val="20"/>
-          <w:szCs w:val="20"/>
-        </w:rPr>
-        <w:t xml:space="preserve">         </w:t>
-      </w:r>
-    </w:p>
-    <w:p>
-      <w:pPr>
-        <w:spacing w:after="200"/>
-      </w:pPr>
-      <w:r>
-        <w:t xml:space="preserve"> </w:t>
-      </w:r>
-    </w:p>
-    <w:p>
-      <w:pPr>
-        <w:spacing w:after="120"/>
-      </w:pPr>
-      <w:r>
-        <w:rPr>
-          <w:b/>
-          <w:bCs/>
-        </w:rPr>
-        <w:t>6. View events across the namespace:</w:t>
-      </w:r>
-    </w:p>
-    <w:p>
-      <w:pPr>
-        <w:spacing w:after="200"/>
-      </w:pPr>
-      <w:r>
-        <w:t xml:space="preserve"> </w:t>
-      </w:r>
-    </w:p>
-    <w:p>
-      <w:pPr>
-        <w:shd w:val="clear" w:color="auto" w:fill="000000"/>
-        <w:spacing w:before="160" w:after="200"/>
-        <w:ind w:left="240" w:right="240"/>
-      </w:pPr>
-      <w:r>
-        <w:rPr>
-          <w:rFonts w:ascii="Courier New" w:eastAsia="Courier New" w:hAnsi="Courier New" w:cs="Courier New"/>
-          <w:color w:val="FFFFFF"/>
-          <w:sz w:val="20"/>
-          <w:szCs w:val="20"/>
-        </w:rPr>
-        <w:t xml:space="preserve">         </w:t>
-      </w:r>
-      <w:r>
-        <w:br/>
-      </w:r>
-      <w:r>
-        <w:rPr>
-          <w:rFonts w:ascii="Courier New" w:eastAsia="Courier New" w:hAnsi="Courier New" w:cs="Courier New"/>
-          <w:color w:val="FFFFFF"/>
-          <w:sz w:val="20"/>
-          <w:szCs w:val="20"/>
-        </w:rPr>
-        <w:t xml:space="preserve">    </w:t>
-      </w:r>
-      <w:proofErr w:type="spellStart"/>
-      <w:r>
-        <w:rPr>
-          <w:rFonts w:ascii="Courier New" w:eastAsia="Courier New" w:hAnsi="Courier New" w:cs="Courier New"/>
-          <w:color w:val="FFFFFF"/>
-          <w:sz w:val="20"/>
-          <w:szCs w:val="20"/>
-        </w:rPr>
-        <w:t>oc</w:t>
-      </w:r>
-      <w:proofErr w:type="spellEnd"/>
-      <w:r>
-        <w:rPr>
-          <w:rFonts w:ascii="Courier New" w:eastAsia="Courier New" w:hAnsi="Courier New" w:cs="Courier New"/>
-          <w:color w:val="FFFFFF"/>
-          <w:sz w:val="20"/>
-          <w:szCs w:val="20"/>
-        </w:rPr>
-        <w:t xml:space="preserve"> get events -n </w:t>
-      </w:r>
-      <w:proofErr w:type="spellStart"/>
-      <w:r>
-        <w:rPr>
-          <w:rFonts w:ascii="Courier New" w:eastAsia="Courier New" w:hAnsi="Courier New" w:cs="Courier New"/>
-          <w:color w:val="FFFFFF"/>
-          <w:sz w:val="20"/>
-          <w:szCs w:val="20"/>
-        </w:rPr>
-        <w:t>nfcu</w:t>
-      </w:r>
-      <w:proofErr w:type="spellEnd"/>
-      <w:r>
-        <w:rPr>
-          <w:rFonts w:ascii="Courier New" w:eastAsia="Courier New" w:hAnsi="Courier New" w:cs="Courier New"/>
-          <w:color w:val="FFFFFF"/>
-          <w:sz w:val="20"/>
-          <w:szCs w:val="20"/>
-        </w:rPr>
-        <w:t>-demo --sort-by=</w:t>
-      </w:r>
-      <w:proofErr w:type="gramStart"/>
-      <w:r>
-        <w:rPr>
-          <w:rFonts w:ascii="Courier New" w:eastAsia="Courier New" w:hAnsi="Courier New" w:cs="Courier New"/>
-          <w:color w:val="FFFFFF"/>
-          <w:sz w:val="20"/>
-          <w:szCs w:val="20"/>
-        </w:rPr>
-        <w:t>'.</w:t>
-      </w:r>
-      <w:proofErr w:type="spellStart"/>
-      <w:r>
-        <w:rPr>
-          <w:rFonts w:ascii="Courier New" w:eastAsia="Courier New" w:hAnsi="Courier New" w:cs="Courier New"/>
-          <w:color w:val="FFFFFF"/>
-          <w:sz w:val="20"/>
-          <w:szCs w:val="20"/>
-        </w:rPr>
-        <w:t>lastTimestamp</w:t>
-      </w:r>
-      <w:proofErr w:type="spellEnd"/>
-      <w:proofErr w:type="gramEnd"/>
-      <w:r>
-        <w:rPr>
-          <w:rFonts w:ascii="Courier New" w:eastAsia="Courier New" w:hAnsi="Courier New" w:cs="Courier New"/>
-          <w:color w:val="FFFFFF"/>
-          <w:sz w:val="20"/>
-          <w:szCs w:val="20"/>
-        </w:rPr>
-        <w:t xml:space="preserve">'    </w:t>
-      </w:r>
-      <w:r>
-        <w:br/>
-      </w:r>
-      <w:r>
-        <w:rPr>
-          <w:rFonts w:ascii="Courier New" w:eastAsia="Courier New" w:hAnsi="Courier New" w:cs="Courier New"/>
-          <w:color w:val="FFFFFF"/>
-          <w:sz w:val="20"/>
-          <w:szCs w:val="20"/>
-        </w:rPr>
-        <w:t xml:space="preserve">         </w:t>
-      </w:r>
-    </w:p>
-    <w:p>
-      <w:pPr>
-        <w:spacing w:after="200"/>
-      </w:pPr>
-      <w:r>
-        <w:lastRenderedPageBreak/>
-        <w:t xml:space="preserve"> </w:t>
-      </w:r>
-    </w:p>
-    <w:p>
-      <w:pPr>
-        <w:spacing w:after="120"/>
-      </w:pPr>
-      <w:r>
-        <w:t>This shows a timeline of all recent events and is often the fastest way to identify what went wrong.</w:t>
       </w:r>
     </w:p>
     <w:p>
@@ -6479,7 +5326,15 @@
       </w:r>
       <w:proofErr w:type="spellEnd"/>
       <w:r>
-        <w:t xml:space="preserve"> becomes ready</w:t>
+        <w:t xml:space="preserve"> </w:t>
+      </w:r>
+      <w:proofErr w:type="gramStart"/>
+      <w:r>
+        <w:t>becomes</w:t>
+      </w:r>
+      <w:proofErr w:type="gramEnd"/>
+      <w:r>
+        <w:t xml:space="preserve"> ready</w:t>
       </w:r>
     </w:p>
     <w:p>
@@ -6575,16 +5430,9 @@
           <w:color w:val="0563C1"/>
           <w:u w:val="single"/>
         </w:rPr>
-        <w:t>`</w:t>
-      </w:r>
-      <w:proofErr w:type="spellStart"/>
-      <w:r>
-        <w:rPr>
-          <w:color w:val="0563C1"/>
-          <w:u w:val="single"/>
-        </w:rPr>
-        <w:t>webgui-</w:t>
-      </w:r>
+        <w:t>`webgui-</w:t>
+      </w:r>
+      <w:proofErr w:type="spellStart"/>
       <w:proofErr w:type="gramStart"/>
       <w:r>
         <w:rPr>
@@ -6698,9 +5546,16 @@
           <w:rFonts w:ascii="Courier New" w:eastAsia="Courier New" w:hAnsi="Courier New" w:cs="Courier New"/>
           <w:shd w:val="clear" w:color="auto" w:fill="F1F5F9"/>
         </w:rPr>
-        <w:t>quickstart-webgui</w:t>
-      </w:r>
-      <w:proofErr w:type="spellEnd"/>
+        <w:t>quickstart</w:t>
+      </w:r>
+      <w:proofErr w:type="spellEnd"/>
+      <w:r>
+        <w:rPr>
+          <w:rFonts w:ascii="Courier New" w:eastAsia="Courier New" w:hAnsi="Courier New" w:cs="Courier New"/>
+          <w:shd w:val="clear" w:color="auto" w:fill="F1F5F9"/>
+        </w:rPr>
+        <w:t>-webgui</w:t>
+      </w:r>
     </w:p>
     <w:p>
       <w:pPr>
@@ -6741,6 +5596,7 @@
         <w:spacing w:after="100"/>
       </w:pPr>
       <w:r>
+        <w:lastRenderedPageBreak/>
         <w:t xml:space="preserve">apps domain: </w:t>
       </w:r>
       <w:r>
@@ -6989,18 +5845,9 @@
           <w:sz w:val="20"/>
           <w:szCs w:val="20"/>
         </w:rPr>
-        <w:t xml:space="preserve"> apply -f </w:t>
-      </w:r>
-      <w:proofErr w:type="spellStart"/>
-      <w:r>
-        <w:rPr>
-          <w:rFonts w:ascii="Courier New" w:eastAsia="Courier New" w:hAnsi="Courier New" w:cs="Courier New"/>
-          <w:color w:val="FFFFFF"/>
-          <w:sz w:val="20"/>
-          <w:szCs w:val="20"/>
-        </w:rPr>
-        <w:t>webgui-</w:t>
-      </w:r>
+        <w:t xml:space="preserve"> apply -f webgui-</w:t>
+      </w:r>
+      <w:proofErr w:type="spellStart"/>
       <w:proofErr w:type="gramStart"/>
       <w:r>
         <w:rPr>
@@ -7032,7 +5879,6 @@
           <w:sz w:val="20"/>
           <w:szCs w:val="20"/>
         </w:rPr>
-        <w:lastRenderedPageBreak/>
         <w:t xml:space="preserve">    </w:t>
       </w:r>
       <w:proofErr w:type="spellStart"/>
@@ -7053,18 +5899,9 @@
           <w:sz w:val="20"/>
           <w:szCs w:val="20"/>
         </w:rPr>
-        <w:t xml:space="preserve"> apply -f </w:t>
-      </w:r>
-      <w:proofErr w:type="spellStart"/>
-      <w:r>
-        <w:rPr>
-          <w:rFonts w:ascii="Courier New" w:eastAsia="Courier New" w:hAnsi="Courier New" w:cs="Courier New"/>
-          <w:color w:val="FFFFFF"/>
-          <w:sz w:val="20"/>
-          <w:szCs w:val="20"/>
-        </w:rPr>
-        <w:t>webgui-</w:t>
-      </w:r>
+        <w:t xml:space="preserve"> apply -f webgui-</w:t>
+      </w:r>
+      <w:proofErr w:type="spellStart"/>
       <w:proofErr w:type="gramStart"/>
       <w:r>
         <w:rPr>
@@ -7272,7 +6109,15 @@
         <w:ind w:left="20"/>
       </w:pPr>
       <w:r>
-        <w:t>4. Retrieve the created route hostnames:</w:t>
+        <w:t xml:space="preserve">4. Retrieve the </w:t>
+      </w:r>
+      <w:proofErr w:type="gramStart"/>
+      <w:r>
+        <w:t>created route hostnames</w:t>
+      </w:r>
+      <w:proofErr w:type="gramEnd"/>
+      <w:r>
+        <w:t>:</w:t>
       </w:r>
     </w:p>
     <w:p>
@@ -7370,17 +6215,17 @@
           <w:sz w:val="20"/>
           <w:szCs w:val="20"/>
         </w:rPr>
-        <w:t>quickstart-webgui</w:t>
-      </w:r>
-      <w:proofErr w:type="spellEnd"/>
-      <w:r>
-        <w:rPr>
-          <w:rFonts w:ascii="Courier New" w:eastAsia="Courier New" w:hAnsi="Courier New" w:cs="Courier New"/>
-          <w:color w:val="FFFFFF"/>
-          <w:sz w:val="20"/>
-          <w:szCs w:val="20"/>
-        </w:rPr>
-        <w:t xml:space="preserve"> -o </w:t>
+        <w:t>quickstart</w:t>
+      </w:r>
+      <w:proofErr w:type="spellEnd"/>
+      <w:r>
+        <w:rPr>
+          <w:rFonts w:ascii="Courier New" w:eastAsia="Courier New" w:hAnsi="Courier New" w:cs="Courier New"/>
+          <w:color w:val="FFFFFF"/>
+          <w:sz w:val="20"/>
+          <w:szCs w:val="20"/>
+        </w:rPr>
+        <w:t xml:space="preserve">-webgui -o </w:t>
       </w:r>
       <w:proofErr w:type="spellStart"/>
       <w:r>
@@ -7640,8 +6485,13 @@
         <w:spacing w:after="200"/>
       </w:pPr>
       <w:r>
-        <w:t>Lab 7: Validate the Deployment</w:t>
-      </w:r>
+        <w:t xml:space="preserve">Lab 7: Validate </w:t>
+      </w:r>
+      <w:proofErr w:type="gramStart"/>
+      <w:r>
+        <w:t>the Deployment</w:t>
+      </w:r>
+      <w:proofErr w:type="gramEnd"/>
     </w:p>
     <w:p>
       <w:pPr>
@@ -7649,6 +6499,7 @@
         <w:spacing w:after="200"/>
       </w:pPr>
       <w:r>
+        <w:lastRenderedPageBreak/>
         <w:t>Objective</w:t>
       </w:r>
     </w:p>
@@ -7657,7 +6508,15 @@
         <w:spacing w:after="120"/>
       </w:pPr>
       <w:r>
-        <w:t>Confirm the deployment works from both the admin and API sides.</w:t>
+        <w:t xml:space="preserve">Confirm the deployment </w:t>
+      </w:r>
+      <w:proofErr w:type="gramStart"/>
+      <w:r>
+        <w:t>works</w:t>
+      </w:r>
+      <w:proofErr w:type="gramEnd"/>
+      <w:r>
+        <w:t xml:space="preserve"> from both the admin and API sides.</w:t>
       </w:r>
     </w:p>
     <w:p>
@@ -7683,7 +6542,82 @@
         <w:ind w:left="20"/>
       </w:pPr>
       <w:r>
-        <w:t>1. Open the web UI in a browser using the route hostname.</w:t>
+        <w:t xml:space="preserve">1. Open the web UI in a browser using the </w:t>
+      </w:r>
+      <w:proofErr w:type="spellStart"/>
+      <w:r>
+        <w:rPr>
+          <w:rFonts w:ascii="Courier New" w:eastAsia="Courier New" w:hAnsi="Courier New" w:cs="Courier New"/>
+          <w:shd w:val="clear" w:color="auto" w:fill="F1F5F9"/>
+        </w:rPr>
+        <w:t>quickstart</w:t>
+      </w:r>
+      <w:proofErr w:type="spellEnd"/>
+      <w:r>
+        <w:rPr>
+          <w:rFonts w:ascii="Courier New" w:eastAsia="Courier New" w:hAnsi="Courier New" w:cs="Courier New"/>
+          <w:shd w:val="clear" w:color="auto" w:fill="F1F5F9"/>
+        </w:rPr>
+        <w:t>-webgui</w:t>
+      </w:r>
+      <w:r>
+        <w:t xml:space="preserve"> route hostname:</w:t>
+      </w:r>
+    </w:p>
+    <w:p>
+      <w:pPr>
+        <w:spacing w:after="200"/>
+      </w:pPr>
+      <w:r>
+        <w:t xml:space="preserve"> </w:t>
+      </w:r>
+    </w:p>
+    <w:p>
+      <w:pPr>
+        <w:shd w:val="clear" w:color="auto" w:fill="000000"/>
+        <w:spacing w:before="160" w:after="200"/>
+        <w:ind w:left="240" w:right="240"/>
+      </w:pPr>
+      <w:r>
+        <w:rPr>
+          <w:rFonts w:ascii="Courier New" w:eastAsia="Courier New" w:hAnsi="Courier New" w:cs="Courier New"/>
+          <w:color w:val="FFFFFF"/>
+          <w:sz w:val="20"/>
+          <w:szCs w:val="20"/>
+        </w:rPr>
+        <w:t xml:space="preserve">         </w:t>
+      </w:r>
+      <w:r>
+        <w:br/>
+      </w:r>
+      <w:r>
+        <w:rPr>
+          <w:rFonts w:ascii="Courier New" w:eastAsia="Courier New" w:hAnsi="Courier New" w:cs="Courier New"/>
+          <w:color w:val="FFFFFF"/>
+          <w:sz w:val="20"/>
+          <w:szCs w:val="20"/>
+        </w:rPr>
+        <w:t xml:space="preserve">    https://&lt;quickstart-webgui-route-host&gt;    </w:t>
+      </w:r>
+      <w:r>
+        <w:br/>
+      </w:r>
+      <w:r>
+        <w:rPr>
+          <w:rFonts w:ascii="Courier New" w:eastAsia="Courier New" w:hAnsi="Courier New" w:cs="Courier New"/>
+          <w:color w:val="FFFFFF"/>
+          <w:sz w:val="20"/>
+          <w:szCs w:val="20"/>
+        </w:rPr>
+        <w:t xml:space="preserve">         </w:t>
+      </w:r>
+    </w:p>
+    <w:p>
+      <w:pPr>
+        <w:spacing w:after="200"/>
+      </w:pPr>
+      <w:r>
+        <w:t xml:space="preserve"> </w:t>
       </w:r>
     </w:p>
     <w:p>
@@ -7749,7 +6683,6 @@
         <w:ind w:left="20"/>
       </w:pPr>
       <w:r>
-        <w:lastRenderedPageBreak/>
         <w:t xml:space="preserve">3. Confirm the </w:t>
       </w:r>
       <w:r>
@@ -7779,63 +6712,63 @@
         <w:ind w:left="20"/>
       </w:pPr>
       <w:r>
-        <w:t>4. Test the MPG route:</w:t>
-      </w:r>
-    </w:p>
-    <w:p>
-      <w:pPr>
-        <w:spacing w:after="200"/>
-      </w:pPr>
-      <w:r>
-        <w:t xml:space="preserve"> </w:t>
-      </w:r>
-    </w:p>
-    <w:p>
-      <w:pPr>
-        <w:shd w:val="clear" w:color="auto" w:fill="000000"/>
-        <w:spacing w:before="160" w:after="200"/>
-        <w:ind w:left="240" w:right="240"/>
-      </w:pPr>
-      <w:r>
-        <w:rPr>
-          <w:rFonts w:ascii="Courier New" w:eastAsia="Courier New" w:hAnsi="Courier New" w:cs="Courier New"/>
-          <w:color w:val="FFFFFF"/>
-          <w:sz w:val="20"/>
-          <w:szCs w:val="20"/>
-        </w:rPr>
-        <w:t xml:space="preserve">         </w:t>
-      </w:r>
-      <w:r>
-        <w:br/>
-      </w:r>
-      <w:r>
-        <w:rPr>
-          <w:rFonts w:ascii="Courier New" w:eastAsia="Courier New" w:hAnsi="Courier New" w:cs="Courier New"/>
-          <w:color w:val="FFFFFF"/>
-          <w:sz w:val="20"/>
-          <w:szCs w:val="20"/>
-        </w:rPr>
-        <w:t xml:space="preserve">    curl -k http://&lt;mpg-route-host&gt;/ -v    </w:t>
-      </w:r>
-      <w:r>
-        <w:br/>
-      </w:r>
-      <w:r>
-        <w:rPr>
-          <w:rFonts w:ascii="Courier New" w:eastAsia="Courier New" w:hAnsi="Courier New" w:cs="Courier New"/>
-          <w:color w:val="FFFFFF"/>
-          <w:sz w:val="20"/>
-          <w:szCs w:val="20"/>
-        </w:rPr>
-        <w:t xml:space="preserve">         </w:t>
-      </w:r>
-    </w:p>
-    <w:p>
-      <w:pPr>
-        <w:spacing w:after="200"/>
-      </w:pPr>
-      <w:r>
-        <w:t xml:space="preserve"> </w:t>
+        <w:t xml:space="preserve">4. Test the MPG </w:t>
+      </w:r>
+      <w:proofErr w:type="spellStart"/>
+      <w:proofErr w:type="gramStart"/>
+      <w:r>
+        <w:t>route:a</w:t>
+      </w:r>
+      <w:proofErr w:type="spellEnd"/>
+      <w:r>
+        <w:t>.</w:t>
+      </w:r>
+      <w:proofErr w:type="gramEnd"/>
+      <w:r>
+        <w:t xml:space="preserve"> Download </w:t>
+      </w:r>
+      <w:proofErr w:type="gramStart"/>
+      <w:r>
+        <w:rPr>
+          <w:rFonts w:ascii="Courier New" w:eastAsia="Courier New" w:hAnsi="Courier New" w:cs="Courier New"/>
+          <w:shd w:val="clear" w:color="auto" w:fill="F1F5F9"/>
+        </w:rPr>
+        <w:t>mpg-expose.zip</w:t>
+      </w:r>
+      <w:r>
+        <w:t>:https://github.com/innessrg/NFCU_DataPower_MVP1/blob/main/mpg-expose.zipb</w:t>
+      </w:r>
+      <w:proofErr w:type="gramEnd"/>
+      <w:r>
+        <w:t xml:space="preserve">. Import into the </w:t>
+      </w:r>
+      <w:r>
+        <w:rPr>
+          <w:rFonts w:ascii="Courier New" w:eastAsia="Courier New" w:hAnsi="Courier New" w:cs="Courier New"/>
+          <w:shd w:val="clear" w:color="auto" w:fill="F1F5F9"/>
+        </w:rPr>
+        <w:t>demo</w:t>
+      </w:r>
+      <w:r>
+        <w:t xml:space="preserve"> </w:t>
+      </w:r>
+      <w:proofErr w:type="spellStart"/>
+      <w:r>
+        <w:t>domain.c</w:t>
+      </w:r>
+      <w:proofErr w:type="spellEnd"/>
+      <w:r>
+        <w:t xml:space="preserve">. Test the service using the curl command below or paste the endpoint in your </w:t>
+      </w:r>
+      <w:proofErr w:type="spellStart"/>
+      <w:proofErr w:type="gramStart"/>
+      <w:r>
+        <w:t>browser:curl</w:t>
+      </w:r>
+      <w:proofErr w:type="spellEnd"/>
+      <w:proofErr w:type="gramEnd"/>
+      <w:r>
+        <w:t xml:space="preserve"> -k http://&lt;route-latin-bonobo-host&gt;/sample-request-v</w:t>
       </w:r>
     </w:p>
     <w:p>
@@ -7845,14 +6778,6 @@
       </w:pPr>
       <w:r>
         <w:t>5. Review cluster objects:</w:t>
-      </w:r>
-    </w:p>
-    <w:p>
-      <w:pPr>
-        <w:spacing w:after="200"/>
-      </w:pPr>
-      <w:r>
-        <w:t xml:space="preserve"> </w:t>
       </w:r>
     </w:p>
     <w:p>
@@ -8074,6 +6999,1200 @@
       <w:proofErr w:type="spellEnd"/>
       <w:r>
         <w:t xml:space="preserve"> lab</w:t>
+      </w:r>
+    </w:p>
+    <w:p>
+      <w:pPr>
+        <w:spacing w:after="200"/>
+      </w:pPr>
+      <w:r>
+        <w:t xml:space="preserve"> </w:t>
+      </w:r>
+    </w:p>
+    <w:p>
+      <w:pPr>
+        <w:pBdr>
+          <w:bottom w:val="single" w:sz="6" w:space="1" w:color="auto"/>
+        </w:pBdr>
+        <w:spacing w:after="120"/>
+      </w:pPr>
+    </w:p>
+    <w:p>
+      <w:pPr>
+        <w:spacing w:after="200"/>
+      </w:pPr>
+      <w:r>
+        <w:t xml:space="preserve"> </w:t>
+      </w:r>
+    </w:p>
+    <w:p>
+      <w:pPr>
+        <w:pStyle w:val="Heading3"/>
+        <w:spacing w:after="200"/>
+      </w:pPr>
+      <w:r>
+        <w:lastRenderedPageBreak/>
+        <w:t xml:space="preserve">Troubleshooting: </w:t>
+      </w:r>
+      <w:proofErr w:type="spellStart"/>
+      <w:r>
+        <w:t>DataPowerService</w:t>
+      </w:r>
+      <w:proofErr w:type="spellEnd"/>
+      <w:r>
+        <w:t xml:space="preserve"> Failed to Create</w:t>
+      </w:r>
+    </w:p>
+    <w:p>
+      <w:pPr>
+        <w:spacing w:after="120"/>
+      </w:pPr>
+      <w:r>
+        <w:t xml:space="preserve">If the </w:t>
+      </w:r>
+      <w:proofErr w:type="spellStart"/>
+      <w:r>
+        <w:t>DataPowerService</w:t>
+      </w:r>
+      <w:proofErr w:type="spellEnd"/>
+      <w:r>
+        <w:t xml:space="preserve"> does not come up, check the following:</w:t>
+      </w:r>
+    </w:p>
+    <w:p>
+      <w:pPr>
+        <w:spacing w:after="200"/>
+      </w:pPr>
+      <w:r>
+        <w:t xml:space="preserve"> </w:t>
+      </w:r>
+    </w:p>
+    <w:p>
+      <w:pPr>
+        <w:spacing w:after="120"/>
+      </w:pPr>
+      <w:r>
+        <w:rPr>
+          <w:b/>
+          <w:bCs/>
+        </w:rPr>
+        <w:t>1. Check the pod status and events:</w:t>
+      </w:r>
+    </w:p>
+    <w:p>
+      <w:pPr>
+        <w:spacing w:after="200"/>
+      </w:pPr>
+      <w:r>
+        <w:t xml:space="preserve"> </w:t>
+      </w:r>
+    </w:p>
+    <w:p>
+      <w:pPr>
+        <w:shd w:val="clear" w:color="auto" w:fill="000000"/>
+        <w:spacing w:before="160" w:after="200"/>
+        <w:ind w:left="240" w:right="240"/>
+      </w:pPr>
+      <w:r>
+        <w:rPr>
+          <w:rFonts w:ascii="Courier New" w:eastAsia="Courier New" w:hAnsi="Courier New" w:cs="Courier New"/>
+          <w:color w:val="FFFFFF"/>
+          <w:sz w:val="20"/>
+          <w:szCs w:val="20"/>
+        </w:rPr>
+        <w:t xml:space="preserve">         </w:t>
+      </w:r>
+      <w:r>
+        <w:br/>
+      </w:r>
+      <w:r>
+        <w:rPr>
+          <w:rFonts w:ascii="Courier New" w:eastAsia="Courier New" w:hAnsi="Courier New" w:cs="Courier New"/>
+          <w:color w:val="FFFFFF"/>
+          <w:sz w:val="20"/>
+          <w:szCs w:val="20"/>
+        </w:rPr>
+        <w:t xml:space="preserve">    </w:t>
+      </w:r>
+      <w:proofErr w:type="spellStart"/>
+      <w:r>
+        <w:rPr>
+          <w:rFonts w:ascii="Courier New" w:eastAsia="Courier New" w:hAnsi="Courier New" w:cs="Courier New"/>
+          <w:color w:val="FFFFFF"/>
+          <w:sz w:val="20"/>
+          <w:szCs w:val="20"/>
+        </w:rPr>
+        <w:t>oc</w:t>
+      </w:r>
+      <w:proofErr w:type="spellEnd"/>
+      <w:r>
+        <w:rPr>
+          <w:rFonts w:ascii="Courier New" w:eastAsia="Courier New" w:hAnsi="Courier New" w:cs="Courier New"/>
+          <w:color w:val="FFFFFF"/>
+          <w:sz w:val="20"/>
+          <w:szCs w:val="20"/>
+        </w:rPr>
+        <w:t xml:space="preserve"> get pods -n </w:t>
+      </w:r>
+      <w:proofErr w:type="spellStart"/>
+      <w:r>
+        <w:rPr>
+          <w:rFonts w:ascii="Courier New" w:eastAsia="Courier New" w:hAnsi="Courier New" w:cs="Courier New"/>
+          <w:color w:val="FFFFFF"/>
+          <w:sz w:val="20"/>
+          <w:szCs w:val="20"/>
+        </w:rPr>
+        <w:t>nfcu</w:t>
+      </w:r>
+      <w:proofErr w:type="spellEnd"/>
+      <w:r>
+        <w:rPr>
+          <w:rFonts w:ascii="Courier New" w:eastAsia="Courier New" w:hAnsi="Courier New" w:cs="Courier New"/>
+          <w:color w:val="FFFFFF"/>
+          <w:sz w:val="20"/>
+          <w:szCs w:val="20"/>
+        </w:rPr>
+        <w:t xml:space="preserve">-demo    </w:t>
+      </w:r>
+      <w:r>
+        <w:br/>
+      </w:r>
+      <w:r>
+        <w:rPr>
+          <w:rFonts w:ascii="Courier New" w:eastAsia="Courier New" w:hAnsi="Courier New" w:cs="Courier New"/>
+          <w:color w:val="FFFFFF"/>
+          <w:sz w:val="20"/>
+          <w:szCs w:val="20"/>
+        </w:rPr>
+        <w:t xml:space="preserve">    </w:t>
+      </w:r>
+      <w:proofErr w:type="spellStart"/>
+      <w:r>
+        <w:rPr>
+          <w:rFonts w:ascii="Courier New" w:eastAsia="Courier New" w:hAnsi="Courier New" w:cs="Courier New"/>
+          <w:color w:val="FFFFFF"/>
+          <w:sz w:val="20"/>
+          <w:szCs w:val="20"/>
+        </w:rPr>
+        <w:t>oc</w:t>
+      </w:r>
+      <w:proofErr w:type="spellEnd"/>
+      <w:r>
+        <w:rPr>
+          <w:rFonts w:ascii="Courier New" w:eastAsia="Courier New" w:hAnsi="Courier New" w:cs="Courier New"/>
+          <w:color w:val="FFFFFF"/>
+          <w:sz w:val="20"/>
+          <w:szCs w:val="20"/>
+        </w:rPr>
+        <w:t xml:space="preserve"> describe pod quickstart-0 -n </w:t>
+      </w:r>
+      <w:proofErr w:type="spellStart"/>
+      <w:r>
+        <w:rPr>
+          <w:rFonts w:ascii="Courier New" w:eastAsia="Courier New" w:hAnsi="Courier New" w:cs="Courier New"/>
+          <w:color w:val="FFFFFF"/>
+          <w:sz w:val="20"/>
+          <w:szCs w:val="20"/>
+        </w:rPr>
+        <w:t>nfcu</w:t>
+      </w:r>
+      <w:proofErr w:type="spellEnd"/>
+      <w:r>
+        <w:rPr>
+          <w:rFonts w:ascii="Courier New" w:eastAsia="Courier New" w:hAnsi="Courier New" w:cs="Courier New"/>
+          <w:color w:val="FFFFFF"/>
+          <w:sz w:val="20"/>
+          <w:szCs w:val="20"/>
+        </w:rPr>
+        <w:t xml:space="preserve">-demo    </w:t>
+      </w:r>
+      <w:r>
+        <w:br/>
+      </w:r>
+      <w:r>
+        <w:rPr>
+          <w:rFonts w:ascii="Courier New" w:eastAsia="Courier New" w:hAnsi="Courier New" w:cs="Courier New"/>
+          <w:color w:val="FFFFFF"/>
+          <w:sz w:val="20"/>
+          <w:szCs w:val="20"/>
+        </w:rPr>
+        <w:t xml:space="preserve">         </w:t>
+      </w:r>
+    </w:p>
+    <w:p>
+      <w:pPr>
+        <w:spacing w:after="200"/>
+      </w:pPr>
+      <w:r>
+        <w:t xml:space="preserve"> </w:t>
+      </w:r>
+    </w:p>
+    <w:p>
+      <w:pPr>
+        <w:spacing w:after="120"/>
+      </w:pPr>
+      <w:r>
+        <w:t xml:space="preserve">Look at the </w:t>
+      </w:r>
+      <w:r>
+        <w:rPr>
+          <w:b/>
+          <w:bCs/>
+        </w:rPr>
+        <w:t>Events</w:t>
+      </w:r>
+      <w:r>
+        <w:t xml:space="preserve"> section at the bottom of the </w:t>
+      </w:r>
+      <w:r>
+        <w:rPr>
+          <w:rFonts w:ascii="Courier New" w:eastAsia="Courier New" w:hAnsi="Courier New" w:cs="Courier New"/>
+          <w:shd w:val="clear" w:color="auto" w:fill="F1F5F9"/>
+        </w:rPr>
+        <w:t>describe</w:t>
+      </w:r>
+      <w:r>
+        <w:t xml:space="preserve"> output — it will show pull errors, scheduling failures, or config issues.</w:t>
+      </w:r>
+    </w:p>
+    <w:p>
+      <w:pPr>
+        <w:spacing w:after="200"/>
+      </w:pPr>
+      <w:r>
+        <w:t xml:space="preserve"> </w:t>
+      </w:r>
+    </w:p>
+    <w:p>
+      <w:pPr>
+        <w:spacing w:after="120"/>
+      </w:pPr>
+      <w:r>
+        <w:rPr>
+          <w:b/>
+          <w:bCs/>
+        </w:rPr>
+        <w:t xml:space="preserve">2. Check the </w:t>
+      </w:r>
+      <w:proofErr w:type="spellStart"/>
+      <w:r>
+        <w:rPr>
+          <w:b/>
+          <w:bCs/>
+        </w:rPr>
+        <w:t>DataPowerService</w:t>
+      </w:r>
+      <w:proofErr w:type="spellEnd"/>
+      <w:r>
+        <w:rPr>
+          <w:b/>
+          <w:bCs/>
+        </w:rPr>
+        <w:t xml:space="preserve"> resource status:</w:t>
+      </w:r>
+    </w:p>
+    <w:p>
+      <w:pPr>
+        <w:spacing w:after="200"/>
+      </w:pPr>
+      <w:r>
+        <w:t xml:space="preserve"> </w:t>
+      </w:r>
+    </w:p>
+    <w:p>
+      <w:pPr>
+        <w:shd w:val="clear" w:color="auto" w:fill="000000"/>
+        <w:spacing w:before="160" w:after="200"/>
+        <w:ind w:left="240" w:right="240"/>
+      </w:pPr>
+      <w:r>
+        <w:rPr>
+          <w:rFonts w:ascii="Courier New" w:eastAsia="Courier New" w:hAnsi="Courier New" w:cs="Courier New"/>
+          <w:color w:val="FFFFFF"/>
+          <w:sz w:val="20"/>
+          <w:szCs w:val="20"/>
+        </w:rPr>
+        <w:t xml:space="preserve">         </w:t>
+      </w:r>
+      <w:r>
+        <w:br/>
+      </w:r>
+      <w:r>
+        <w:rPr>
+          <w:rFonts w:ascii="Courier New" w:eastAsia="Courier New" w:hAnsi="Courier New" w:cs="Courier New"/>
+          <w:color w:val="FFFFFF"/>
+          <w:sz w:val="20"/>
+          <w:szCs w:val="20"/>
+        </w:rPr>
+        <w:t xml:space="preserve">    </w:t>
+      </w:r>
+      <w:proofErr w:type="spellStart"/>
+      <w:r>
+        <w:rPr>
+          <w:rFonts w:ascii="Courier New" w:eastAsia="Courier New" w:hAnsi="Courier New" w:cs="Courier New"/>
+          <w:color w:val="FFFFFF"/>
+          <w:sz w:val="20"/>
+          <w:szCs w:val="20"/>
+        </w:rPr>
+        <w:t>oc</w:t>
+      </w:r>
+      <w:proofErr w:type="spellEnd"/>
+      <w:r>
+        <w:rPr>
+          <w:rFonts w:ascii="Courier New" w:eastAsia="Courier New" w:hAnsi="Courier New" w:cs="Courier New"/>
+          <w:color w:val="FFFFFF"/>
+          <w:sz w:val="20"/>
+          <w:szCs w:val="20"/>
+        </w:rPr>
+        <w:t xml:space="preserve"> describe </w:t>
+      </w:r>
+      <w:proofErr w:type="spellStart"/>
+      <w:r>
+        <w:rPr>
+          <w:rFonts w:ascii="Courier New" w:eastAsia="Courier New" w:hAnsi="Courier New" w:cs="Courier New"/>
+          <w:color w:val="FFFFFF"/>
+          <w:sz w:val="20"/>
+          <w:szCs w:val="20"/>
+        </w:rPr>
+        <w:t>datapowerservice</w:t>
+      </w:r>
+      <w:proofErr w:type="spellEnd"/>
+      <w:r>
+        <w:rPr>
+          <w:rFonts w:ascii="Courier New" w:eastAsia="Courier New" w:hAnsi="Courier New" w:cs="Courier New"/>
+          <w:color w:val="FFFFFF"/>
+          <w:sz w:val="20"/>
+          <w:szCs w:val="20"/>
+        </w:rPr>
+        <w:t xml:space="preserve"> </w:t>
+      </w:r>
+      <w:proofErr w:type="spellStart"/>
+      <w:r>
+        <w:rPr>
+          <w:rFonts w:ascii="Courier New" w:eastAsia="Courier New" w:hAnsi="Courier New" w:cs="Courier New"/>
+          <w:color w:val="FFFFFF"/>
+          <w:sz w:val="20"/>
+          <w:szCs w:val="20"/>
+        </w:rPr>
+        <w:t>quickstart</w:t>
+      </w:r>
+      <w:proofErr w:type="spellEnd"/>
+      <w:r>
+        <w:rPr>
+          <w:rFonts w:ascii="Courier New" w:eastAsia="Courier New" w:hAnsi="Courier New" w:cs="Courier New"/>
+          <w:color w:val="FFFFFF"/>
+          <w:sz w:val="20"/>
+          <w:szCs w:val="20"/>
+        </w:rPr>
+        <w:t xml:space="preserve"> -n </w:t>
+      </w:r>
+      <w:proofErr w:type="spellStart"/>
+      <w:r>
+        <w:rPr>
+          <w:rFonts w:ascii="Courier New" w:eastAsia="Courier New" w:hAnsi="Courier New" w:cs="Courier New"/>
+          <w:color w:val="FFFFFF"/>
+          <w:sz w:val="20"/>
+          <w:szCs w:val="20"/>
+        </w:rPr>
+        <w:t>nfcu</w:t>
+      </w:r>
+      <w:proofErr w:type="spellEnd"/>
+      <w:r>
+        <w:rPr>
+          <w:rFonts w:ascii="Courier New" w:eastAsia="Courier New" w:hAnsi="Courier New" w:cs="Courier New"/>
+          <w:color w:val="FFFFFF"/>
+          <w:sz w:val="20"/>
+          <w:szCs w:val="20"/>
+        </w:rPr>
+        <w:t xml:space="preserve">-demo    </w:t>
+      </w:r>
+      <w:r>
+        <w:br/>
+      </w:r>
+      <w:r>
+        <w:rPr>
+          <w:rFonts w:ascii="Courier New" w:eastAsia="Courier New" w:hAnsi="Courier New" w:cs="Courier New"/>
+          <w:color w:val="FFFFFF"/>
+          <w:sz w:val="20"/>
+          <w:szCs w:val="20"/>
+        </w:rPr>
+        <w:t xml:space="preserve">         </w:t>
+      </w:r>
+    </w:p>
+    <w:p>
+      <w:pPr>
+        <w:spacing w:after="200"/>
+      </w:pPr>
+      <w:r>
+        <w:t xml:space="preserve"> </w:t>
+      </w:r>
+    </w:p>
+    <w:p>
+      <w:pPr>
+        <w:spacing w:after="120"/>
+      </w:pPr>
+      <w:r>
+        <w:t xml:space="preserve">Look for any status conditions or error messages under </w:t>
+      </w:r>
+      <w:r>
+        <w:rPr>
+          <w:b/>
+          <w:bCs/>
+        </w:rPr>
+        <w:t>Status</w:t>
+      </w:r>
+      <w:r>
+        <w:t>.</w:t>
+      </w:r>
+    </w:p>
+    <w:p>
+      <w:pPr>
+        <w:spacing w:after="200"/>
+      </w:pPr>
+      <w:r>
+        <w:t xml:space="preserve"> </w:t>
+      </w:r>
+    </w:p>
+    <w:p>
+      <w:pPr>
+        <w:spacing w:after="120"/>
+      </w:pPr>
+      <w:r>
+        <w:rPr>
+          <w:b/>
+          <w:bCs/>
+        </w:rPr>
+        <w:t>3. Check the operator logs:</w:t>
+      </w:r>
+    </w:p>
+    <w:p>
+      <w:pPr>
+        <w:spacing w:after="200"/>
+      </w:pPr>
+      <w:r>
+        <w:t xml:space="preserve"> </w:t>
+      </w:r>
+    </w:p>
+    <w:p>
+      <w:pPr>
+        <w:shd w:val="clear" w:color="auto" w:fill="000000"/>
+        <w:spacing w:before="160" w:after="200"/>
+        <w:ind w:left="240" w:right="240"/>
+      </w:pPr>
+      <w:r>
+        <w:rPr>
+          <w:rFonts w:ascii="Courier New" w:eastAsia="Courier New" w:hAnsi="Courier New" w:cs="Courier New"/>
+          <w:color w:val="FFFFFF"/>
+          <w:sz w:val="20"/>
+          <w:szCs w:val="20"/>
+        </w:rPr>
+        <w:t xml:space="preserve">         </w:t>
+      </w:r>
+      <w:r>
+        <w:br/>
+      </w:r>
+      <w:r>
+        <w:rPr>
+          <w:rFonts w:ascii="Courier New" w:eastAsia="Courier New" w:hAnsi="Courier New" w:cs="Courier New"/>
+          <w:color w:val="FFFFFF"/>
+          <w:sz w:val="20"/>
+          <w:szCs w:val="20"/>
+        </w:rPr>
+        <w:t xml:space="preserve">    </w:t>
+      </w:r>
+      <w:proofErr w:type="spellStart"/>
+      <w:r>
+        <w:rPr>
+          <w:rFonts w:ascii="Courier New" w:eastAsia="Courier New" w:hAnsi="Courier New" w:cs="Courier New"/>
+          <w:color w:val="FFFFFF"/>
+          <w:sz w:val="20"/>
+          <w:szCs w:val="20"/>
+        </w:rPr>
+        <w:t>oc</w:t>
+      </w:r>
+      <w:proofErr w:type="spellEnd"/>
+      <w:r>
+        <w:rPr>
+          <w:rFonts w:ascii="Courier New" w:eastAsia="Courier New" w:hAnsi="Courier New" w:cs="Courier New"/>
+          <w:color w:val="FFFFFF"/>
+          <w:sz w:val="20"/>
+          <w:szCs w:val="20"/>
+        </w:rPr>
+        <w:t xml:space="preserve"> logs -n </w:t>
+      </w:r>
+      <w:proofErr w:type="spellStart"/>
+      <w:r>
+        <w:rPr>
+          <w:rFonts w:ascii="Courier New" w:eastAsia="Courier New" w:hAnsi="Courier New" w:cs="Courier New"/>
+          <w:color w:val="FFFFFF"/>
+          <w:sz w:val="20"/>
+          <w:szCs w:val="20"/>
+        </w:rPr>
+        <w:t>openshift</w:t>
+      </w:r>
+      <w:proofErr w:type="spellEnd"/>
+      <w:r>
+        <w:rPr>
+          <w:rFonts w:ascii="Courier New" w:eastAsia="Courier New" w:hAnsi="Courier New" w:cs="Courier New"/>
+          <w:color w:val="FFFFFF"/>
+          <w:sz w:val="20"/>
+          <w:szCs w:val="20"/>
+        </w:rPr>
+        <w:t>-operators -l name=</w:t>
+      </w:r>
+      <w:proofErr w:type="spellStart"/>
+      <w:r>
+        <w:rPr>
+          <w:rFonts w:ascii="Courier New" w:eastAsia="Courier New" w:hAnsi="Courier New" w:cs="Courier New"/>
+          <w:color w:val="FFFFFF"/>
+          <w:sz w:val="20"/>
+          <w:szCs w:val="20"/>
+        </w:rPr>
+        <w:t>datapower</w:t>
+      </w:r>
+      <w:proofErr w:type="spellEnd"/>
+      <w:r>
+        <w:rPr>
+          <w:rFonts w:ascii="Courier New" w:eastAsia="Courier New" w:hAnsi="Courier New" w:cs="Courier New"/>
+          <w:color w:val="FFFFFF"/>
+          <w:sz w:val="20"/>
+          <w:szCs w:val="20"/>
+        </w:rPr>
+        <w:t xml:space="preserve">-operator    </w:t>
+      </w:r>
+      <w:r>
+        <w:br/>
+      </w:r>
+      <w:r>
+        <w:rPr>
+          <w:rFonts w:ascii="Courier New" w:eastAsia="Courier New" w:hAnsi="Courier New" w:cs="Courier New"/>
+          <w:color w:val="FFFFFF"/>
+          <w:sz w:val="20"/>
+          <w:szCs w:val="20"/>
+        </w:rPr>
+        <w:t xml:space="preserve">         </w:t>
+      </w:r>
+    </w:p>
+    <w:p>
+      <w:pPr>
+        <w:spacing w:after="200"/>
+      </w:pPr>
+      <w:r>
+        <w:t xml:space="preserve"> </w:t>
+      </w:r>
+    </w:p>
+    <w:p>
+      <w:pPr>
+        <w:spacing w:after="120"/>
+      </w:pPr>
+      <w:r>
+        <w:t>The operator is responsible for creating the pod — its logs will show any reconciliation errors.</w:t>
+      </w:r>
+    </w:p>
+    <w:p>
+      <w:pPr>
+        <w:spacing w:after="200"/>
+      </w:pPr>
+      <w:r>
+        <w:t xml:space="preserve"> </w:t>
+      </w:r>
+    </w:p>
+    <w:p>
+      <w:pPr>
+        <w:spacing w:after="120"/>
+      </w:pPr>
+      <w:r>
+        <w:rPr>
+          <w:b/>
+          <w:bCs/>
+        </w:rPr>
+        <w:t>4. Check for image pull errors:</w:t>
+      </w:r>
+    </w:p>
+    <w:p>
+      <w:pPr>
+        <w:spacing w:after="200"/>
+      </w:pPr>
+      <w:r>
+        <w:t xml:space="preserve"> </w:t>
+      </w:r>
+    </w:p>
+    <w:p>
+      <w:pPr>
+        <w:spacing w:after="120"/>
+      </w:pPr>
+      <w:r>
+        <w:t xml:space="preserve">If the pod is stuck in </w:t>
+      </w:r>
+      <w:proofErr w:type="spellStart"/>
+      <w:r>
+        <w:rPr>
+          <w:rFonts w:ascii="Courier New" w:eastAsia="Courier New" w:hAnsi="Courier New" w:cs="Courier New"/>
+          <w:shd w:val="clear" w:color="auto" w:fill="F1F5F9"/>
+        </w:rPr>
+        <w:t>ImagePullBackOff</w:t>
+      </w:r>
+      <w:proofErr w:type="spellEnd"/>
+      <w:r>
+        <w:t xml:space="preserve"> or </w:t>
+      </w:r>
+      <w:proofErr w:type="spellStart"/>
+      <w:r>
+        <w:rPr>
+          <w:rFonts w:ascii="Courier New" w:eastAsia="Courier New" w:hAnsi="Courier New" w:cs="Courier New"/>
+          <w:shd w:val="clear" w:color="auto" w:fill="F1F5F9"/>
+        </w:rPr>
+        <w:t>ErrImagePull</w:t>
+      </w:r>
+      <w:proofErr w:type="spellEnd"/>
+      <w:r>
+        <w:t>, the IBM entitlement secret is likely missing or not linked. Verify with:</w:t>
+      </w:r>
+    </w:p>
+    <w:p>
+      <w:pPr>
+        <w:spacing w:after="200"/>
+      </w:pPr>
+      <w:r>
+        <w:t xml:space="preserve"> </w:t>
+      </w:r>
+    </w:p>
+    <w:p>
+      <w:pPr>
+        <w:shd w:val="clear" w:color="auto" w:fill="000000"/>
+        <w:spacing w:before="160" w:after="200"/>
+        <w:ind w:left="240" w:right="240"/>
+      </w:pPr>
+      <w:r>
+        <w:rPr>
+          <w:rFonts w:ascii="Courier New" w:eastAsia="Courier New" w:hAnsi="Courier New" w:cs="Courier New"/>
+          <w:color w:val="FFFFFF"/>
+          <w:sz w:val="20"/>
+          <w:szCs w:val="20"/>
+        </w:rPr>
+        <w:lastRenderedPageBreak/>
+        <w:t xml:space="preserve">         </w:t>
+      </w:r>
+      <w:r>
+        <w:br/>
+      </w:r>
+      <w:r>
+        <w:rPr>
+          <w:rFonts w:ascii="Courier New" w:eastAsia="Courier New" w:hAnsi="Courier New" w:cs="Courier New"/>
+          <w:color w:val="FFFFFF"/>
+          <w:sz w:val="20"/>
+          <w:szCs w:val="20"/>
+        </w:rPr>
+        <w:t xml:space="preserve">    </w:t>
+      </w:r>
+      <w:proofErr w:type="spellStart"/>
+      <w:r>
+        <w:rPr>
+          <w:rFonts w:ascii="Courier New" w:eastAsia="Courier New" w:hAnsi="Courier New" w:cs="Courier New"/>
+          <w:color w:val="FFFFFF"/>
+          <w:sz w:val="20"/>
+          <w:szCs w:val="20"/>
+        </w:rPr>
+        <w:t>oc</w:t>
+      </w:r>
+      <w:proofErr w:type="spellEnd"/>
+      <w:r>
+        <w:rPr>
+          <w:rFonts w:ascii="Courier New" w:eastAsia="Courier New" w:hAnsi="Courier New" w:cs="Courier New"/>
+          <w:color w:val="FFFFFF"/>
+          <w:sz w:val="20"/>
+          <w:szCs w:val="20"/>
+        </w:rPr>
+        <w:t xml:space="preserve"> get secret </w:t>
+      </w:r>
+      <w:proofErr w:type="spellStart"/>
+      <w:r>
+        <w:rPr>
+          <w:rFonts w:ascii="Courier New" w:eastAsia="Courier New" w:hAnsi="Courier New" w:cs="Courier New"/>
+          <w:color w:val="FFFFFF"/>
+          <w:sz w:val="20"/>
+          <w:szCs w:val="20"/>
+        </w:rPr>
+        <w:t>ibm</w:t>
+      </w:r>
+      <w:proofErr w:type="spellEnd"/>
+      <w:r>
+        <w:rPr>
+          <w:rFonts w:ascii="Courier New" w:eastAsia="Courier New" w:hAnsi="Courier New" w:cs="Courier New"/>
+          <w:color w:val="FFFFFF"/>
+          <w:sz w:val="20"/>
+          <w:szCs w:val="20"/>
+        </w:rPr>
+        <w:t xml:space="preserve">-entitlement-key -n </w:t>
+      </w:r>
+      <w:proofErr w:type="spellStart"/>
+      <w:r>
+        <w:rPr>
+          <w:rFonts w:ascii="Courier New" w:eastAsia="Courier New" w:hAnsi="Courier New" w:cs="Courier New"/>
+          <w:color w:val="FFFFFF"/>
+          <w:sz w:val="20"/>
+          <w:szCs w:val="20"/>
+        </w:rPr>
+        <w:t>nfcu</w:t>
+      </w:r>
+      <w:proofErr w:type="spellEnd"/>
+      <w:r>
+        <w:rPr>
+          <w:rFonts w:ascii="Courier New" w:eastAsia="Courier New" w:hAnsi="Courier New" w:cs="Courier New"/>
+          <w:color w:val="FFFFFF"/>
+          <w:sz w:val="20"/>
+          <w:szCs w:val="20"/>
+        </w:rPr>
+        <w:t xml:space="preserve">-demo    </w:t>
+      </w:r>
+      <w:r>
+        <w:br/>
+      </w:r>
+      <w:r>
+        <w:rPr>
+          <w:rFonts w:ascii="Courier New" w:eastAsia="Courier New" w:hAnsi="Courier New" w:cs="Courier New"/>
+          <w:color w:val="FFFFFF"/>
+          <w:sz w:val="20"/>
+          <w:szCs w:val="20"/>
+        </w:rPr>
+        <w:t xml:space="preserve">    </w:t>
+      </w:r>
+      <w:proofErr w:type="spellStart"/>
+      <w:r>
+        <w:rPr>
+          <w:rFonts w:ascii="Courier New" w:eastAsia="Courier New" w:hAnsi="Courier New" w:cs="Courier New"/>
+          <w:color w:val="FFFFFF"/>
+          <w:sz w:val="20"/>
+          <w:szCs w:val="20"/>
+        </w:rPr>
+        <w:t>oc</w:t>
+      </w:r>
+      <w:proofErr w:type="spellEnd"/>
+      <w:r>
+        <w:rPr>
+          <w:rFonts w:ascii="Courier New" w:eastAsia="Courier New" w:hAnsi="Courier New" w:cs="Courier New"/>
+          <w:color w:val="FFFFFF"/>
+          <w:sz w:val="20"/>
+          <w:szCs w:val="20"/>
+        </w:rPr>
+        <w:t xml:space="preserve"> get </w:t>
+      </w:r>
+      <w:proofErr w:type="spellStart"/>
+      <w:r>
+        <w:rPr>
+          <w:rFonts w:ascii="Courier New" w:eastAsia="Courier New" w:hAnsi="Courier New" w:cs="Courier New"/>
+          <w:color w:val="FFFFFF"/>
+          <w:sz w:val="20"/>
+          <w:szCs w:val="20"/>
+        </w:rPr>
+        <w:t>serviceaccount</w:t>
+      </w:r>
+      <w:proofErr w:type="spellEnd"/>
+      <w:r>
+        <w:rPr>
+          <w:rFonts w:ascii="Courier New" w:eastAsia="Courier New" w:hAnsi="Courier New" w:cs="Courier New"/>
+          <w:color w:val="FFFFFF"/>
+          <w:sz w:val="20"/>
+          <w:szCs w:val="20"/>
+        </w:rPr>
+        <w:t xml:space="preserve"> default -n </w:t>
+      </w:r>
+      <w:proofErr w:type="spellStart"/>
+      <w:r>
+        <w:rPr>
+          <w:rFonts w:ascii="Courier New" w:eastAsia="Courier New" w:hAnsi="Courier New" w:cs="Courier New"/>
+          <w:color w:val="FFFFFF"/>
+          <w:sz w:val="20"/>
+          <w:szCs w:val="20"/>
+        </w:rPr>
+        <w:t>nfcu</w:t>
+      </w:r>
+      <w:proofErr w:type="spellEnd"/>
+      <w:r>
+        <w:rPr>
+          <w:rFonts w:ascii="Courier New" w:eastAsia="Courier New" w:hAnsi="Courier New" w:cs="Courier New"/>
+          <w:color w:val="FFFFFF"/>
+          <w:sz w:val="20"/>
+          <w:szCs w:val="20"/>
+        </w:rPr>
+        <w:t xml:space="preserve">-demo -o </w:t>
+      </w:r>
+      <w:proofErr w:type="spellStart"/>
+      <w:r>
+        <w:rPr>
+          <w:rFonts w:ascii="Courier New" w:eastAsia="Courier New" w:hAnsi="Courier New" w:cs="Courier New"/>
+          <w:color w:val="FFFFFF"/>
+          <w:sz w:val="20"/>
+          <w:szCs w:val="20"/>
+        </w:rPr>
+        <w:t>yaml</w:t>
+      </w:r>
+      <w:proofErr w:type="spellEnd"/>
+      <w:r>
+        <w:rPr>
+          <w:rFonts w:ascii="Courier New" w:eastAsia="Courier New" w:hAnsi="Courier New" w:cs="Courier New"/>
+          <w:color w:val="FFFFFF"/>
+          <w:sz w:val="20"/>
+          <w:szCs w:val="20"/>
+        </w:rPr>
+        <w:t xml:space="preserve"> | grep </w:t>
+      </w:r>
+      <w:proofErr w:type="spellStart"/>
+      <w:r>
+        <w:rPr>
+          <w:rFonts w:ascii="Courier New" w:eastAsia="Courier New" w:hAnsi="Courier New" w:cs="Courier New"/>
+          <w:color w:val="FFFFFF"/>
+          <w:sz w:val="20"/>
+          <w:szCs w:val="20"/>
+        </w:rPr>
+        <w:t>ibm</w:t>
+      </w:r>
+      <w:proofErr w:type="spellEnd"/>
+      <w:r>
+        <w:rPr>
+          <w:rFonts w:ascii="Courier New" w:eastAsia="Courier New" w:hAnsi="Courier New" w:cs="Courier New"/>
+          <w:color w:val="FFFFFF"/>
+          <w:sz w:val="20"/>
+          <w:szCs w:val="20"/>
+        </w:rPr>
+        <w:t xml:space="preserve">-entitlement-key    </w:t>
+      </w:r>
+      <w:r>
+        <w:br/>
+      </w:r>
+      <w:r>
+        <w:rPr>
+          <w:rFonts w:ascii="Courier New" w:eastAsia="Courier New" w:hAnsi="Courier New" w:cs="Courier New"/>
+          <w:color w:val="FFFFFF"/>
+          <w:sz w:val="20"/>
+          <w:szCs w:val="20"/>
+        </w:rPr>
+        <w:t xml:space="preserve">         </w:t>
+      </w:r>
+    </w:p>
+    <w:p>
+      <w:pPr>
+        <w:spacing w:after="200"/>
+      </w:pPr>
+      <w:r>
+        <w:t xml:space="preserve"> </w:t>
+      </w:r>
+    </w:p>
+    <w:p>
+      <w:pPr>
+        <w:spacing w:after="120"/>
+      </w:pPr>
+      <w:r>
+        <w:rPr>
+          <w:b/>
+          <w:bCs/>
+        </w:rPr>
+        <w:t xml:space="preserve">5. Check for missing secrets or </w:t>
+      </w:r>
+      <w:proofErr w:type="spellStart"/>
+      <w:r>
+        <w:rPr>
+          <w:b/>
+          <w:bCs/>
+        </w:rPr>
+        <w:t>ConfigMaps</w:t>
+      </w:r>
+      <w:proofErr w:type="spellEnd"/>
+      <w:r>
+        <w:rPr>
+          <w:b/>
+          <w:bCs/>
+        </w:rPr>
+        <w:t>:</w:t>
+      </w:r>
+    </w:p>
+    <w:p>
+      <w:pPr>
+        <w:spacing w:after="200"/>
+      </w:pPr>
+      <w:r>
+        <w:t xml:space="preserve"> </w:t>
+      </w:r>
+    </w:p>
+    <w:p>
+      <w:pPr>
+        <w:spacing w:after="120"/>
+      </w:pPr>
+      <w:r>
+        <w:t xml:space="preserve">If the pod fails with a mount error, a referenced secret or </w:t>
+      </w:r>
+      <w:proofErr w:type="spellStart"/>
+      <w:r>
+        <w:t>ConfigMap</w:t>
+      </w:r>
+      <w:proofErr w:type="spellEnd"/>
+      <w:r>
+        <w:t xml:space="preserve"> may not exist. Verify all required resources from Lab 4 are present:</w:t>
+      </w:r>
+    </w:p>
+    <w:p>
+      <w:pPr>
+        <w:spacing w:after="200"/>
+      </w:pPr>
+      <w:r>
+        <w:t xml:space="preserve"> </w:t>
+      </w:r>
+    </w:p>
+    <w:p>
+      <w:pPr>
+        <w:shd w:val="clear" w:color="auto" w:fill="000000"/>
+        <w:spacing w:before="160" w:after="200"/>
+        <w:ind w:left="240" w:right="240"/>
+      </w:pPr>
+      <w:r>
+        <w:rPr>
+          <w:rFonts w:ascii="Courier New" w:eastAsia="Courier New" w:hAnsi="Courier New" w:cs="Courier New"/>
+          <w:color w:val="FFFFFF"/>
+          <w:sz w:val="20"/>
+          <w:szCs w:val="20"/>
+        </w:rPr>
+        <w:t xml:space="preserve">         </w:t>
+      </w:r>
+      <w:r>
+        <w:br/>
+      </w:r>
+      <w:r>
+        <w:rPr>
+          <w:rFonts w:ascii="Courier New" w:eastAsia="Courier New" w:hAnsi="Courier New" w:cs="Courier New"/>
+          <w:color w:val="FFFFFF"/>
+          <w:sz w:val="20"/>
+          <w:szCs w:val="20"/>
+        </w:rPr>
+        <w:t xml:space="preserve">    </w:t>
+      </w:r>
+      <w:proofErr w:type="spellStart"/>
+      <w:r>
+        <w:rPr>
+          <w:rFonts w:ascii="Courier New" w:eastAsia="Courier New" w:hAnsi="Courier New" w:cs="Courier New"/>
+          <w:color w:val="FFFFFF"/>
+          <w:sz w:val="20"/>
+          <w:szCs w:val="20"/>
+        </w:rPr>
+        <w:t>oc</w:t>
+      </w:r>
+      <w:proofErr w:type="spellEnd"/>
+      <w:r>
+        <w:rPr>
+          <w:rFonts w:ascii="Courier New" w:eastAsia="Courier New" w:hAnsi="Courier New" w:cs="Courier New"/>
+          <w:color w:val="FFFFFF"/>
+          <w:sz w:val="20"/>
+          <w:szCs w:val="20"/>
+        </w:rPr>
+        <w:t xml:space="preserve"> get </w:t>
+      </w:r>
+      <w:proofErr w:type="spellStart"/>
+      <w:proofErr w:type="gramStart"/>
+      <w:r>
+        <w:rPr>
+          <w:rFonts w:ascii="Courier New" w:eastAsia="Courier New" w:hAnsi="Courier New" w:cs="Courier New"/>
+          <w:color w:val="FFFFFF"/>
+          <w:sz w:val="20"/>
+          <w:szCs w:val="20"/>
+        </w:rPr>
+        <w:t>secret,configmap</w:t>
+      </w:r>
+      <w:proofErr w:type="spellEnd"/>
+      <w:proofErr w:type="gramEnd"/>
+      <w:r>
+        <w:rPr>
+          <w:rFonts w:ascii="Courier New" w:eastAsia="Courier New" w:hAnsi="Courier New" w:cs="Courier New"/>
+          <w:color w:val="FFFFFF"/>
+          <w:sz w:val="20"/>
+          <w:szCs w:val="20"/>
+        </w:rPr>
+        <w:t xml:space="preserve"> -n </w:t>
+      </w:r>
+      <w:proofErr w:type="spellStart"/>
+      <w:r>
+        <w:rPr>
+          <w:rFonts w:ascii="Courier New" w:eastAsia="Courier New" w:hAnsi="Courier New" w:cs="Courier New"/>
+          <w:color w:val="FFFFFF"/>
+          <w:sz w:val="20"/>
+          <w:szCs w:val="20"/>
+        </w:rPr>
+        <w:t>nfcu</w:t>
+      </w:r>
+      <w:proofErr w:type="spellEnd"/>
+      <w:r>
+        <w:rPr>
+          <w:rFonts w:ascii="Courier New" w:eastAsia="Courier New" w:hAnsi="Courier New" w:cs="Courier New"/>
+          <w:color w:val="FFFFFF"/>
+          <w:sz w:val="20"/>
+          <w:szCs w:val="20"/>
+        </w:rPr>
+        <w:t xml:space="preserve">-demo    </w:t>
+      </w:r>
+      <w:r>
+        <w:br/>
+      </w:r>
+      <w:r>
+        <w:rPr>
+          <w:rFonts w:ascii="Courier New" w:eastAsia="Courier New" w:hAnsi="Courier New" w:cs="Courier New"/>
+          <w:color w:val="FFFFFF"/>
+          <w:sz w:val="20"/>
+          <w:szCs w:val="20"/>
+        </w:rPr>
+        <w:t xml:space="preserve">         </w:t>
+      </w:r>
+    </w:p>
+    <w:p>
+      <w:pPr>
+        <w:spacing w:after="200"/>
+      </w:pPr>
+      <w:r>
+        <w:t xml:space="preserve"> </w:t>
+      </w:r>
+    </w:p>
+    <w:p>
+      <w:pPr>
+        <w:spacing w:after="120"/>
+      </w:pPr>
+      <w:r>
+        <w:rPr>
+          <w:b/>
+          <w:bCs/>
+        </w:rPr>
+        <w:t>6. View events across the namespace:</w:t>
+      </w:r>
+    </w:p>
+    <w:p>
+      <w:pPr>
+        <w:spacing w:after="200"/>
+      </w:pPr>
+      <w:r>
+        <w:t xml:space="preserve"> </w:t>
+      </w:r>
+    </w:p>
+    <w:p>
+      <w:pPr>
+        <w:shd w:val="clear" w:color="auto" w:fill="000000"/>
+        <w:spacing w:before="160" w:after="200"/>
+        <w:ind w:left="240" w:right="240"/>
+      </w:pPr>
+      <w:r>
+        <w:rPr>
+          <w:rFonts w:ascii="Courier New" w:eastAsia="Courier New" w:hAnsi="Courier New" w:cs="Courier New"/>
+          <w:color w:val="FFFFFF"/>
+          <w:sz w:val="20"/>
+          <w:szCs w:val="20"/>
+        </w:rPr>
+        <w:t xml:space="preserve">         </w:t>
+      </w:r>
+      <w:r>
+        <w:br/>
+      </w:r>
+      <w:r>
+        <w:rPr>
+          <w:rFonts w:ascii="Courier New" w:eastAsia="Courier New" w:hAnsi="Courier New" w:cs="Courier New"/>
+          <w:color w:val="FFFFFF"/>
+          <w:sz w:val="20"/>
+          <w:szCs w:val="20"/>
+        </w:rPr>
+        <w:t xml:space="preserve">    </w:t>
+      </w:r>
+      <w:proofErr w:type="spellStart"/>
+      <w:r>
+        <w:rPr>
+          <w:rFonts w:ascii="Courier New" w:eastAsia="Courier New" w:hAnsi="Courier New" w:cs="Courier New"/>
+          <w:color w:val="FFFFFF"/>
+          <w:sz w:val="20"/>
+          <w:szCs w:val="20"/>
+        </w:rPr>
+        <w:t>oc</w:t>
+      </w:r>
+      <w:proofErr w:type="spellEnd"/>
+      <w:r>
+        <w:rPr>
+          <w:rFonts w:ascii="Courier New" w:eastAsia="Courier New" w:hAnsi="Courier New" w:cs="Courier New"/>
+          <w:color w:val="FFFFFF"/>
+          <w:sz w:val="20"/>
+          <w:szCs w:val="20"/>
+        </w:rPr>
+        <w:t xml:space="preserve"> get events -n </w:t>
+      </w:r>
+      <w:proofErr w:type="spellStart"/>
+      <w:r>
+        <w:rPr>
+          <w:rFonts w:ascii="Courier New" w:eastAsia="Courier New" w:hAnsi="Courier New" w:cs="Courier New"/>
+          <w:color w:val="FFFFFF"/>
+          <w:sz w:val="20"/>
+          <w:szCs w:val="20"/>
+        </w:rPr>
+        <w:t>nfcu</w:t>
+      </w:r>
+      <w:proofErr w:type="spellEnd"/>
+      <w:r>
+        <w:rPr>
+          <w:rFonts w:ascii="Courier New" w:eastAsia="Courier New" w:hAnsi="Courier New" w:cs="Courier New"/>
+          <w:color w:val="FFFFFF"/>
+          <w:sz w:val="20"/>
+          <w:szCs w:val="20"/>
+        </w:rPr>
+        <w:t>-demo --sort-by=</w:t>
+      </w:r>
+      <w:proofErr w:type="gramStart"/>
+      <w:r>
+        <w:rPr>
+          <w:rFonts w:ascii="Courier New" w:eastAsia="Courier New" w:hAnsi="Courier New" w:cs="Courier New"/>
+          <w:color w:val="FFFFFF"/>
+          <w:sz w:val="20"/>
+          <w:szCs w:val="20"/>
+        </w:rPr>
+        <w:t>'.</w:t>
+      </w:r>
+      <w:proofErr w:type="spellStart"/>
+      <w:r>
+        <w:rPr>
+          <w:rFonts w:ascii="Courier New" w:eastAsia="Courier New" w:hAnsi="Courier New" w:cs="Courier New"/>
+          <w:color w:val="FFFFFF"/>
+          <w:sz w:val="20"/>
+          <w:szCs w:val="20"/>
+        </w:rPr>
+        <w:t>lastTimestamp</w:t>
+      </w:r>
+      <w:proofErr w:type="spellEnd"/>
+      <w:proofErr w:type="gramEnd"/>
+      <w:r>
+        <w:rPr>
+          <w:rFonts w:ascii="Courier New" w:eastAsia="Courier New" w:hAnsi="Courier New" w:cs="Courier New"/>
+          <w:color w:val="FFFFFF"/>
+          <w:sz w:val="20"/>
+          <w:szCs w:val="20"/>
+        </w:rPr>
+        <w:t xml:space="preserve">'    </w:t>
+      </w:r>
+      <w:r>
+        <w:br/>
+      </w:r>
+      <w:r>
+        <w:rPr>
+          <w:rFonts w:ascii="Courier New" w:eastAsia="Courier New" w:hAnsi="Courier New" w:cs="Courier New"/>
+          <w:color w:val="FFFFFF"/>
+          <w:sz w:val="20"/>
+          <w:szCs w:val="20"/>
+        </w:rPr>
+        <w:t xml:space="preserve">         </w:t>
+      </w:r>
+    </w:p>
+    <w:p>
+      <w:pPr>
+        <w:spacing w:after="200"/>
+      </w:pPr>
+      <w:r>
+        <w:t xml:space="preserve"> </w:t>
+      </w:r>
+    </w:p>
+    <w:p>
+      <w:pPr>
+        <w:spacing w:after="120"/>
+      </w:pPr>
+      <w:r>
+        <w:t>This shows a timeline of all recent events and is often the fastest way to identify what went wrong.</w:t>
       </w:r>
     </w:p>
     <w:p>
@@ -8128,98 +8247,12 @@
 </file>
 
 <file path=word/numbering.xml><?xml version="1.0" encoding="utf-8"?>
-<w:numbering xmlns:wpc="http://schemas.microsoft.com/office/word/2010/wordprocessingCanvas" xmlns:cx="http://schemas.microsoft.com/office/drawing/2014/chartex" xmlns:cx1="http://schemas.microsoft.com/office/drawing/2015/9/8/chartex" xmlns:cx2="http://schemas.microsoft.com/office/drawing/2015/10/21/chartex" xmlns:cx3="http://schemas.microsoft.com/office/drawing/2016/5/9/chartex" xmlns:cx4="http://schemas.microsoft.com/office/drawing/2016/5/10/chartex" xmlns:cx5="http://schemas.microsoft.com/office/drawing/2016/5/11/chartex" xmlns:cx6="http://schemas.microsoft.com/office/drawing/2016/5/12/chartex" xmlns:cx7="http://schemas.microsoft.com/office/drawing/2016/5/13/chartex" xmlns:cx8="http://schemas.microsoft.com/office/drawing/2016/5/14/chartex" xmlns:mc="http://schemas.openxmlformats.org/markup-compatibility/2006" xmlns:m="http://schemas.openxmlformats.org/officeDocument/2006/math" xmlns:aink="http://schemas.microsoft.com/office/drawing/2016/ink" xmlns:am3d="http://schemas.microsoft.com/office/drawing/2017/model3d" xmlns:oel="http://schemas.microsoft.com/office/2019/extlst" xmlns:r="http://schemas.openxmlformats.org/officeDocument/2006/relationships" xmlns:wp14="http://schemas.microsoft.com/office/word/2010/wordprocessingDrawing" xmlns:wp="http://schemas.openxmlformats.org/drawingml/2006/wordprocessingDrawing" xmlns:wpg="http://schemas.microsoft.com/office/word/2010/wordprocessingGroup" xmlns:wpi="http://schemas.microsoft.com/office/word/2010/wordprocessingInk" xmlns:wps="http://schemas.microsoft.com/office/word/2010/wordprocessingShape" xmlns:o="urn:schemas-microsoft-com:office:office" xmlns:v="urn:schemas-microsoft-com:vml" xmlns:w10="urn:schemas-microsoft-com:office:word" xmlns:w="http://schemas.openxmlformats.org/wordprocessingml/2006/main" xmlns:w14="http://schemas.microsoft.com/office/word/2010/wordml" xmlns:w15="http://schemas.microsoft.com/office/word/2012/wordml" xmlns:w16cex="http://schemas.microsoft.com/office/word/2018/wordml/cex" xmlns:w16cid="http://schemas.microsoft.com/office/word/2016/wordml/cid" xmlns:w16="http://schemas.microsoft.com/office/word/2018/wordml" xmlns:w16sdtdh="http://schemas.microsoft.com/office/word/2020/wordml/sdtdatahash" xmlns:w16sdtfl="http://schemas.microsoft.com/office/word/2024/wordml/sdtformatlock" xmlns:w16se="http://schemas.microsoft.com/office/word/2015/wordml/symex" xmlns:w16du="http://schemas.microsoft.com/office/word/2023/wordml/word16du" xmlns:wne="http://schemas.microsoft.com/office/word/2006/wordml" mc:Ignorable="w14 w15 w16se w16cid w16 w16cex w16sdtdh w16sdtfl w16du wp14">
+<w:numbering xmlns:wpc="http://schemas.microsoft.com/office/word/2010/wordprocessingCanvas" xmlns:cx="http://schemas.microsoft.com/office/drawing/2014/chartex" xmlns:cx1="http://schemas.microsoft.com/office/drawing/2015/9/8/chartex" xmlns:cx2="http://schemas.microsoft.com/office/drawing/2015/10/21/chartex" xmlns:cx3="http://schemas.microsoft.com/office/drawing/2016/5/9/chartex" xmlns:cx4="http://schemas.microsoft.com/office/drawing/2016/5/10/chartex" xmlns:cx5="http://schemas.microsoft.com/office/drawing/2016/5/11/chartex" xmlns:cx6="http://schemas.microsoft.com/office/drawing/2016/5/12/chartex" xmlns:cx7="http://schemas.microsoft.com/office/drawing/2016/5/13/chartex" xmlns:cx8="http://schemas.microsoft.com/office/drawing/2016/5/14/chartex" xmlns:mc="http://schemas.openxmlformats.org/markup-compatibility/2006" xmlns:aink="http://schemas.microsoft.com/office/drawing/2016/ink" xmlns:am3d="http://schemas.microsoft.com/office/drawing/2017/model3d" xmlns:o="urn:schemas-microsoft-com:office:office" xmlns:oel="http://schemas.microsoft.com/office/2019/extlst" xmlns:r="http://schemas.openxmlformats.org/officeDocument/2006/relationships" xmlns:m="http://schemas.openxmlformats.org/officeDocument/2006/math" xmlns:v="urn:schemas-microsoft-com:vml" xmlns:wp14="http://schemas.microsoft.com/office/word/2010/wordprocessingDrawing" xmlns:wp="http://schemas.openxmlformats.org/drawingml/2006/wordprocessingDrawing" xmlns:w10="urn:schemas-microsoft-com:office:word" xmlns:w="http://schemas.openxmlformats.org/wordprocessingml/2006/main" xmlns:w14="http://schemas.microsoft.com/office/word/2010/wordml" xmlns:w15="http://schemas.microsoft.com/office/word/2012/wordml" xmlns:w16cex="http://schemas.microsoft.com/office/word/2018/wordml/cex" xmlns:w16cid="http://schemas.microsoft.com/office/word/2016/wordml/cid" xmlns:w16="http://schemas.microsoft.com/office/word/2018/wordml" xmlns:w16du="http://schemas.microsoft.com/office/word/2023/wordml/word16du" xmlns:w16sdtdh="http://schemas.microsoft.com/office/word/2020/wordml/sdtdatahash" xmlns:w16sdtfl="http://schemas.microsoft.com/office/word/2024/wordml/sdtformatlock" xmlns:w16se="http://schemas.microsoft.com/office/word/2015/wordml/symex" xmlns:wpg="http://schemas.microsoft.com/office/word/2010/wordprocessingGroup" xmlns:wpi="http://schemas.microsoft.com/office/word/2010/wordprocessingInk" xmlns:wne="http://schemas.microsoft.com/office/word/2006/wordml" xmlns:wps="http://schemas.microsoft.com/office/word/2010/wordprocessingShape" mc:Ignorable="w14 w15 w16se w16cid w16 w16cex w16sdtdh w16sdtfl w16du wp14">
   <w:abstractNum w:abstractNumId="0" w15:restartNumberingAfterBreak="0">
-    <w:nsid w:val="3E1D2C63"/>
+    <w:nsid w:val="26D61670"/>
     <w:multiLevelType w:val="hybridMultilevel"/>
-    <w:tmpl w:val="495A77E8"/>
-    <w:lvl w:ilvl="0" w:tplc="5BAC3A4C">
-      <w:start w:val="1"/>
-      <w:numFmt w:val="bullet"/>
-      <w:lvlText w:val="●"/>
-      <w:lvlJc w:val="left"/>
-      <w:pPr>
-        <w:ind w:left="720" w:hanging="360"/>
-      </w:pPr>
-    </w:lvl>
-    <w:lvl w:ilvl="1" w:tplc="F5461CA2">
-      <w:start w:val="1"/>
-      <w:numFmt w:val="bullet"/>
-      <w:lvlText w:val="○"/>
-      <w:lvlJc w:val="left"/>
-      <w:pPr>
-        <w:ind w:left="1440" w:hanging="360"/>
-      </w:pPr>
-    </w:lvl>
-    <w:lvl w:ilvl="2" w:tplc="D3120E6E">
-      <w:start w:val="1"/>
-      <w:numFmt w:val="bullet"/>
-      <w:lvlText w:val="■"/>
-      <w:lvlJc w:val="left"/>
-      <w:pPr>
-        <w:ind w:left="2160" w:hanging="360"/>
-      </w:pPr>
-    </w:lvl>
-    <w:lvl w:ilvl="3" w:tplc="0EA2B72E">
-      <w:start w:val="1"/>
-      <w:numFmt w:val="bullet"/>
-      <w:lvlText w:val="●"/>
-      <w:lvlJc w:val="left"/>
-      <w:pPr>
-        <w:ind w:left="2880" w:hanging="360"/>
-      </w:pPr>
-    </w:lvl>
-    <w:lvl w:ilvl="4" w:tplc="13063B5A">
-      <w:start w:val="1"/>
-      <w:numFmt w:val="bullet"/>
-      <w:lvlText w:val="○"/>
-      <w:lvlJc w:val="left"/>
-      <w:pPr>
-        <w:ind w:left="3600" w:hanging="360"/>
-      </w:pPr>
-    </w:lvl>
-    <w:lvl w:ilvl="5" w:tplc="3AB22B2E">
-      <w:start w:val="1"/>
-      <w:numFmt w:val="bullet"/>
-      <w:lvlText w:val="■"/>
-      <w:lvlJc w:val="left"/>
-      <w:pPr>
-        <w:ind w:left="4320" w:hanging="360"/>
-      </w:pPr>
-    </w:lvl>
-    <w:lvl w:ilvl="6" w:tplc="FE36FE7C">
-      <w:start w:val="1"/>
-      <w:numFmt w:val="bullet"/>
-      <w:lvlText w:val="●"/>
-      <w:lvlJc w:val="left"/>
-      <w:pPr>
-        <w:ind w:left="5040" w:hanging="360"/>
-      </w:pPr>
-    </w:lvl>
-    <w:lvl w:ilvl="7" w:tplc="673A9362">
-      <w:start w:val="1"/>
-      <w:numFmt w:val="bullet"/>
-      <w:lvlText w:val="●"/>
-      <w:lvlJc w:val="left"/>
-      <w:pPr>
-        <w:ind w:left="5760" w:hanging="360"/>
-      </w:pPr>
-    </w:lvl>
-    <w:lvl w:ilvl="8" w:tplc="7D0469E4">
-      <w:start w:val="1"/>
-      <w:numFmt w:val="bullet"/>
-      <w:lvlText w:val="●"/>
-      <w:lvlJc w:val="left"/>
-      <w:pPr>
-        <w:ind w:left="6480" w:hanging="360"/>
-      </w:pPr>
-    </w:lvl>
-  </w:abstractNum>
-  <w:abstractNum w:abstractNumId="1" w15:restartNumberingAfterBreak="0">
-    <w:nsid w:val="5CA1468E"/>
-    <w:multiLevelType w:val="hybridMultilevel"/>
-    <w:tmpl w:val="F5625EFC"/>
-    <w:lvl w:ilvl="0" w:tplc="569C1DDE">
+    <w:tmpl w:val="1B3C2AC6"/>
+    <w:lvl w:ilvl="0" w:tplc="6FA0CABC">
       <w:start w:val="1"/>
       <w:numFmt w:val="bullet"/>
       <w:suff w:val="space"/>
@@ -8229,7 +8262,7 @@
         <w:ind w:left="240" w:hanging="180"/>
       </w:pPr>
     </w:lvl>
-    <w:lvl w:ilvl="1" w:tplc="577C880E">
+    <w:lvl w:ilvl="1" w:tplc="2FB0C8CE">
       <w:start w:val="1"/>
       <w:numFmt w:val="bullet"/>
       <w:suff w:val="space"/>
@@ -8239,7 +8272,7 @@
         <w:ind w:left="660" w:hanging="180"/>
       </w:pPr>
     </w:lvl>
-    <w:lvl w:ilvl="2" w:tplc="FADEA4A2">
+    <w:lvl w:ilvl="2" w:tplc="3DC89678">
       <w:start w:val="1"/>
       <w:numFmt w:val="bullet"/>
       <w:suff w:val="space"/>
@@ -8249,7 +8282,7 @@
         <w:ind w:left="1080" w:hanging="180"/>
       </w:pPr>
     </w:lvl>
-    <w:lvl w:ilvl="3" w:tplc="77A0C7DA">
+    <w:lvl w:ilvl="3" w:tplc="E6561FBA">
       <w:start w:val="1"/>
       <w:numFmt w:val="bullet"/>
       <w:suff w:val="space"/>
@@ -8259,7 +8292,7 @@
         <w:ind w:left="1500" w:hanging="180"/>
       </w:pPr>
     </w:lvl>
-    <w:lvl w:ilvl="4" w:tplc="78EA0E32">
+    <w:lvl w:ilvl="4" w:tplc="8BF499F2">
       <w:start w:val="1"/>
       <w:numFmt w:val="bullet"/>
       <w:suff w:val="space"/>
@@ -8269,7 +8302,7 @@
         <w:ind w:left="1920" w:hanging="180"/>
       </w:pPr>
     </w:lvl>
-    <w:lvl w:ilvl="5" w:tplc="147E6E9E">
+    <w:lvl w:ilvl="5" w:tplc="719E4FCC">
       <w:start w:val="1"/>
       <w:numFmt w:val="bullet"/>
       <w:suff w:val="space"/>
@@ -8279,7 +8312,7 @@
         <w:ind w:left="2340" w:hanging="180"/>
       </w:pPr>
     </w:lvl>
-    <w:lvl w:ilvl="6" w:tplc="009A7F66">
+    <w:lvl w:ilvl="6" w:tplc="9C5C2286">
       <w:start w:val="1"/>
       <w:numFmt w:val="bullet"/>
       <w:suff w:val="space"/>
@@ -8289,7 +8322,7 @@
         <w:ind w:left="2760" w:hanging="180"/>
       </w:pPr>
     </w:lvl>
-    <w:lvl w:ilvl="7" w:tplc="CCD0DA32">
+    <w:lvl w:ilvl="7" w:tplc="F4620368">
       <w:start w:val="1"/>
       <w:numFmt w:val="bullet"/>
       <w:suff w:val="space"/>
@@ -8299,7 +8332,7 @@
         <w:ind w:left="3180" w:hanging="180"/>
       </w:pPr>
     </w:lvl>
-    <w:lvl w:ilvl="8" w:tplc="3EB8A038">
+    <w:lvl w:ilvl="8" w:tplc="2C701020">
       <w:start w:val="1"/>
       <w:numFmt w:val="bullet"/>
       <w:suff w:val="space"/>
@@ -8310,14 +8343,100 @@
       </w:pPr>
     </w:lvl>
   </w:abstractNum>
-  <w:num w:numId="1" w16cid:durableId="1167021121">
-    <w:abstractNumId w:val="0"/>
+  <w:abstractNum w:abstractNumId="1" w15:restartNumberingAfterBreak="0">
+    <w:nsid w:val="739F61F9"/>
+    <w:multiLevelType w:val="hybridMultilevel"/>
+    <w:tmpl w:val="D5C4562E"/>
+    <w:lvl w:ilvl="0" w:tplc="99886F18">
+      <w:start w:val="1"/>
+      <w:numFmt w:val="bullet"/>
+      <w:lvlText w:val="●"/>
+      <w:lvlJc w:val="left"/>
+      <w:pPr>
+        <w:ind w:left="720" w:hanging="360"/>
+      </w:pPr>
+    </w:lvl>
+    <w:lvl w:ilvl="1" w:tplc="6C36CF3E">
+      <w:start w:val="1"/>
+      <w:numFmt w:val="bullet"/>
+      <w:lvlText w:val="○"/>
+      <w:lvlJc w:val="left"/>
+      <w:pPr>
+        <w:ind w:left="1440" w:hanging="360"/>
+      </w:pPr>
+    </w:lvl>
+    <w:lvl w:ilvl="2" w:tplc="F6781DC2">
+      <w:start w:val="1"/>
+      <w:numFmt w:val="bullet"/>
+      <w:lvlText w:val="■"/>
+      <w:lvlJc w:val="left"/>
+      <w:pPr>
+        <w:ind w:left="2160" w:hanging="360"/>
+      </w:pPr>
+    </w:lvl>
+    <w:lvl w:ilvl="3" w:tplc="E8ACC888">
+      <w:start w:val="1"/>
+      <w:numFmt w:val="bullet"/>
+      <w:lvlText w:val="●"/>
+      <w:lvlJc w:val="left"/>
+      <w:pPr>
+        <w:ind w:left="2880" w:hanging="360"/>
+      </w:pPr>
+    </w:lvl>
+    <w:lvl w:ilvl="4" w:tplc="BA70E818">
+      <w:start w:val="1"/>
+      <w:numFmt w:val="bullet"/>
+      <w:lvlText w:val="○"/>
+      <w:lvlJc w:val="left"/>
+      <w:pPr>
+        <w:ind w:left="3600" w:hanging="360"/>
+      </w:pPr>
+    </w:lvl>
+    <w:lvl w:ilvl="5" w:tplc="92869E3A">
+      <w:start w:val="1"/>
+      <w:numFmt w:val="bullet"/>
+      <w:lvlText w:val="■"/>
+      <w:lvlJc w:val="left"/>
+      <w:pPr>
+        <w:ind w:left="4320" w:hanging="360"/>
+      </w:pPr>
+    </w:lvl>
+    <w:lvl w:ilvl="6" w:tplc="8AA09726">
+      <w:start w:val="1"/>
+      <w:numFmt w:val="bullet"/>
+      <w:lvlText w:val="●"/>
+      <w:lvlJc w:val="left"/>
+      <w:pPr>
+        <w:ind w:left="5040" w:hanging="360"/>
+      </w:pPr>
+    </w:lvl>
+    <w:lvl w:ilvl="7" w:tplc="FD122402">
+      <w:start w:val="1"/>
+      <w:numFmt w:val="bullet"/>
+      <w:lvlText w:val="●"/>
+      <w:lvlJc w:val="left"/>
+      <w:pPr>
+        <w:ind w:left="5760" w:hanging="360"/>
+      </w:pPr>
+    </w:lvl>
+    <w:lvl w:ilvl="8" w:tplc="D804A5C2">
+      <w:start w:val="1"/>
+      <w:numFmt w:val="bullet"/>
+      <w:lvlText w:val="●"/>
+      <w:lvlJc w:val="left"/>
+      <w:pPr>
+        <w:ind w:left="6480" w:hanging="360"/>
+      </w:pPr>
+    </w:lvl>
+  </w:abstractNum>
+  <w:num w:numId="1" w16cid:durableId="1126268165">
+    <w:abstractNumId w:val="1"/>
     <w:lvlOverride w:ilvl="0">
       <w:startOverride w:val="1"/>
     </w:lvlOverride>
   </w:num>
-  <w:num w:numId="2" w16cid:durableId="600720867">
-    <w:abstractNumId w:val="1"/>
+  <w:num w:numId="2" w16cid:durableId="1063409134">
+    <w:abstractNumId w:val="0"/>
     <w:lvlOverride w:ilvl="0">
       <w:startOverride w:val="1"/>
     </w:lvlOverride>
@@ -8326,7 +8445,7 @@
 </file>
 
 <file path=word/styles.xml><?xml version="1.0" encoding="utf-8"?>
-<w:styles xmlns:mc="http://schemas.openxmlformats.org/markup-compatibility/2006" xmlns:r="http://schemas.openxmlformats.org/officeDocument/2006/relationships" xmlns:w="http://schemas.openxmlformats.org/wordprocessingml/2006/main" xmlns:w14="http://schemas.microsoft.com/office/word/2010/wordml" xmlns:w15="http://schemas.microsoft.com/office/word/2012/wordml" xmlns:w16cex="http://schemas.microsoft.com/office/word/2018/wordml/cex" xmlns:w16cid="http://schemas.microsoft.com/office/word/2016/wordml/cid" xmlns:w16="http://schemas.microsoft.com/office/word/2018/wordml" xmlns:w16sdtdh="http://schemas.microsoft.com/office/word/2020/wordml/sdtdatahash" xmlns:w16sdtfl="http://schemas.microsoft.com/office/word/2024/wordml/sdtformatlock" xmlns:w16se="http://schemas.microsoft.com/office/word/2015/wordml/symex" xmlns:w16du="http://schemas.microsoft.com/office/word/2023/wordml/word16du" mc:Ignorable="w14 w15 w16se w16cid w16 w16cex w16sdtdh w16sdtfl w16du">
+<w:styles xmlns:mc="http://schemas.openxmlformats.org/markup-compatibility/2006" xmlns:r="http://schemas.openxmlformats.org/officeDocument/2006/relationships" xmlns:w="http://schemas.openxmlformats.org/wordprocessingml/2006/main" xmlns:w14="http://schemas.microsoft.com/office/word/2010/wordml" xmlns:w15="http://schemas.microsoft.com/office/word/2012/wordml" xmlns:w16cex="http://schemas.microsoft.com/office/word/2018/wordml/cex" xmlns:w16cid="http://schemas.microsoft.com/office/word/2016/wordml/cid" xmlns:w16="http://schemas.microsoft.com/office/word/2018/wordml" xmlns:w16du="http://schemas.microsoft.com/office/word/2023/wordml/word16du" xmlns:w16sdtdh="http://schemas.microsoft.com/office/word/2020/wordml/sdtdatahash" xmlns:w16sdtfl="http://schemas.microsoft.com/office/word/2024/wordml/sdtformatlock" xmlns:w16se="http://schemas.microsoft.com/office/word/2015/wordml/symex" mc:Ignorable="w14 w15 w16se w16cid w16 w16cex w16sdtdh w16sdtfl w16du">
   <w:docDefaults>
     <w:rPrDefault>
       <w:rPr>

</xml_diff>